<commit_message>
März, Arpil und Mai
</commit_message>
<xml_diff>
--- a/2026/03. März/133. Tagesbericht_Schule.docx
+++ b/2026/03. März/133. Tagesbericht_Schule.docx
@@ -1,21 +1,13 @@
 
 <file path=word/document.xml><?xml version="1.0" encoding="utf-8"?>
-<w:document xmlns:o="urn:schemas-microsoft-com:office:office" xmlns:r="http://schemas.openxmlformats.org/officeDocument/2006/relationships" xmlns:v="urn:schemas-microsoft-com:vml" xmlns:w="http://schemas.openxmlformats.org/wordprocessingml/2006/main" xmlns:w10="urn:schemas-microsoft-com:office:word" xmlns:wp="http://schemas.openxmlformats.org/drawingml/2006/wordprocessingDrawing" xmlns:pic="http://schemas.openxmlformats.org/drawingml/2006/picture" xmlns:wps="http://schemas.microsoft.com/office/word/2010/wordprocessingShape" xmlns:wpg="http://schemas.microsoft.com/office/word/2010/wordprocessingGroup" xmlns:mc="http://schemas.openxmlformats.org/markup-compatibility/2006" xmlns:wp14="http://schemas.microsoft.com/office/word/2010/wordprocessingDrawing" xmlns:w14="http://schemas.microsoft.com/office/word/2010/wordml" xmlns:w15="http://schemas.microsoft.com/office/word/2012/wordml" mc:Ignorable="w14 wp14 w15">
+<w:document xmlns:wpc="http://schemas.microsoft.com/office/word/2010/wordprocessingCanvas" xmlns:cx="http://schemas.microsoft.com/office/drawing/2014/chartex" xmlns:cx1="http://schemas.microsoft.com/office/drawing/2015/9/8/chartex" xmlns:cx2="http://schemas.microsoft.com/office/drawing/2015/10/21/chartex" xmlns:cx3="http://schemas.microsoft.com/office/drawing/2016/5/9/chartex" xmlns:cx4="http://schemas.microsoft.com/office/drawing/2016/5/10/chartex" xmlns:cx5="http://schemas.microsoft.com/office/drawing/2016/5/11/chartex" xmlns:cx6="http://schemas.microsoft.com/office/drawing/2016/5/12/chartex" xmlns:cx7="http://schemas.microsoft.com/office/drawing/2016/5/13/chartex" xmlns:cx8="http://schemas.microsoft.com/office/drawing/2016/5/14/chartex" xmlns:mc="http://schemas.openxmlformats.org/markup-compatibility/2006" xmlns:aink="http://schemas.microsoft.com/office/drawing/2016/ink" xmlns:am3d="http://schemas.microsoft.com/office/drawing/2017/model3d" xmlns:o="urn:schemas-microsoft-com:office:office" xmlns:oel="http://schemas.microsoft.com/office/2019/extlst" xmlns:r="http://schemas.openxmlformats.org/officeDocument/2006/relationships" xmlns:m="http://schemas.openxmlformats.org/officeDocument/2006/math" xmlns:v="urn:schemas-microsoft-com:vml" xmlns:wp14="http://schemas.microsoft.com/office/word/2010/wordprocessingDrawing" xmlns:wp="http://schemas.openxmlformats.org/drawingml/2006/wordprocessingDrawing" xmlns:w10="urn:schemas-microsoft-com:office:word" xmlns:w="http://schemas.openxmlformats.org/wordprocessingml/2006/main" xmlns:w14="http://schemas.microsoft.com/office/word/2010/wordml" xmlns:w15="http://schemas.microsoft.com/office/word/2012/wordml" xmlns:w16cex="http://schemas.microsoft.com/office/word/2018/wordml/cex" xmlns:w16cid="http://schemas.microsoft.com/office/word/2016/wordml/cid" xmlns:w16="http://schemas.microsoft.com/office/word/2018/wordml" xmlns:w16du="http://schemas.microsoft.com/office/word/2023/wordml/word16du" xmlns:w16sdtdh="http://schemas.microsoft.com/office/word/2020/wordml/sdtdatahash" xmlns:w16sdtfl="http://schemas.microsoft.com/office/word/2024/wordml/sdtformatlock" xmlns:w16se="http://schemas.microsoft.com/office/word/2015/wordml/symex" xmlns:wpg="http://schemas.microsoft.com/office/word/2010/wordprocessingGroup" xmlns:wpi="http://schemas.microsoft.com/office/word/2010/wordprocessingInk" xmlns:wne="http://schemas.microsoft.com/office/word/2006/wordml" xmlns:wps="http://schemas.microsoft.com/office/word/2010/wordprocessingShape" mc:Ignorable="w14 w15 w16se w16cid w16 w16cex w16sdtdh w16sdtfl w16du wp14">
   <w:body>
     <w:tbl>
       <w:tblPr>
-        <w:tblpPr w:vertAnchor="text" w:horzAnchor="margin" w:leftFromText="141" w:rightFromText="141" w:tblpX="0" w:tblpY="1681"/>
+        <w:tblpPr w:leftFromText="141" w:rightFromText="141" w:vertAnchor="text" w:horzAnchor="margin" w:tblpY="1681"/>
         <w:tblW w:w="9640" w:type="dxa"/>
-        <w:jc w:val="start"/>
-        <w:tblInd w:w="-5" w:type="dxa"/>
         <w:tblLayout w:type="fixed"/>
-        <w:tblCellMar>
-          <w:top w:w="0" w:type="dxa"/>
-          <w:start w:w="108" w:type="dxa"/>
-          <w:bottom w:w="0" w:type="dxa"/>
-          <w:end w:w="108" w:type="dxa"/>
-        </w:tblCellMar>
-        <w:tblLook w:val="01e0" w:noHBand="0" w:noVBand="0" w:firstColumn="1" w:lastRow="1" w:lastColumn="1" w:firstRow="1"/>
+        <w:tblLook w:val="01E0" w:firstRow="1" w:lastRow="1" w:firstColumn="1" w:lastColumn="1" w:noHBand="0" w:noVBand="0"/>
       </w:tblPr>
       <w:tblGrid>
         <w:gridCol w:w="1383"/>
@@ -23,34 +15,26 @@
         <w:gridCol w:w="1174"/>
       </w:tblGrid>
       <w:tr>
-        <w:trPr/>
         <w:tc>
           <w:tcPr>
             <w:tcW w:w="1383" w:type="dxa"/>
             <w:tcBorders>
               <w:top w:val="single" w:sz="4" w:space="0" w:color="000000"/>
-              <w:start w:val="single" w:sz="4" w:space="0" w:color="000000"/>
+              <w:left w:val="single" w:sz="4" w:space="0" w:color="000000"/>
               <w:bottom w:val="single" w:sz="4" w:space="0" w:color="000000"/>
-              <w:end w:val="single" w:sz="4" w:space="0" w:color="000000"/>
-            </w:tcBorders>
-            <w:shd w:color="auto" w:fill="C0C0C0" w:val="clear"/>
+              <w:right w:val="single" w:sz="4" w:space="0" w:color="000000"/>
+            </w:tcBorders>
+            <w:shd w:val="clear" w:color="auto" w:fill="C0C0C0"/>
             <w:vAlign w:val="center"/>
           </w:tcPr>
           <w:p>
             <w:pPr>
-              <w:pStyle w:val="Normal"/>
-              <w:spacing w:lineRule="exact" w:line="260"/>
-              <w:rPr>
-                <w:sz w:val="22"/>
-                <w:szCs w:val="22"/>
-              </w:rPr>
-            </w:pPr>
-            <w:r>
-              <w:rPr>
-                <w:sz w:val="22"/>
-                <w:szCs w:val="22"/>
-              </w:rPr>
-            </w:r>
+              <w:spacing w:line="260" w:lineRule="exact"/>
+              <w:rPr>
+                <w:sz w:val="22"/>
+                <w:szCs w:val="22"/>
+              </w:rPr>
+            </w:pPr>
           </w:p>
         </w:tc>
         <w:tc>
@@ -58,17 +42,16 @@
             <w:tcW w:w="7083" w:type="dxa"/>
             <w:tcBorders>
               <w:top w:val="single" w:sz="4" w:space="0" w:color="000000"/>
-              <w:start w:val="single" w:sz="4" w:space="0" w:color="000000"/>
+              <w:left w:val="single" w:sz="4" w:space="0" w:color="000000"/>
               <w:bottom w:val="single" w:sz="4" w:space="0" w:color="000000"/>
-              <w:end w:val="single" w:sz="4" w:space="0" w:color="000000"/>
-            </w:tcBorders>
-            <w:shd w:color="auto" w:fill="C0C0C0" w:val="clear"/>
+              <w:right w:val="single" w:sz="4" w:space="0" w:color="000000"/>
+            </w:tcBorders>
+            <w:shd w:val="clear" w:color="auto" w:fill="C0C0C0"/>
             <w:vAlign w:val="center"/>
           </w:tcPr>
           <w:p>
             <w:pPr>
-              <w:pStyle w:val="Normal"/>
-              <w:spacing w:lineRule="exact" w:line="260"/>
+              <w:spacing w:line="260" w:lineRule="exact"/>
               <w:rPr>
                 <w:sz w:val="22"/>
                 <w:szCs w:val="22"/>
@@ -88,17 +71,16 @@
             <w:tcW w:w="1174" w:type="dxa"/>
             <w:tcBorders>
               <w:top w:val="single" w:sz="4" w:space="0" w:color="000000"/>
-              <w:start w:val="single" w:sz="4" w:space="0" w:color="000000"/>
+              <w:left w:val="single" w:sz="4" w:space="0" w:color="000000"/>
               <w:bottom w:val="single" w:sz="4" w:space="0" w:color="000000"/>
-              <w:end w:val="single" w:sz="4" w:space="0" w:color="000000"/>
-            </w:tcBorders>
-            <w:shd w:color="auto" w:fill="C0C0C0" w:val="clear"/>
+              <w:right w:val="single" w:sz="4" w:space="0" w:color="000000"/>
+            </w:tcBorders>
+            <w:shd w:val="clear" w:color="auto" w:fill="C0C0C0"/>
             <w:vAlign w:val="center"/>
           </w:tcPr>
           <w:p>
             <w:pPr>
-              <w:pStyle w:val="Normal"/>
-              <w:spacing w:lineRule="exact" w:line="260"/>
+              <w:spacing w:line="260" w:lineRule="exact"/>
               <w:rPr>
                 <w:i/>
                 <w:sz w:val="22"/>
@@ -118,22 +100,21 @@
       </w:tr>
       <w:tr>
         <w:trPr>
-          <w:trHeight w:val="163" w:hRule="atLeast"/>
+          <w:trHeight w:val="163"/>
         </w:trPr>
         <w:tc>
           <w:tcPr>
             <w:tcW w:w="1383" w:type="dxa"/>
             <w:tcBorders>
               <w:top w:val="single" w:sz="4" w:space="0" w:color="000000"/>
-              <w:start w:val="single" w:sz="4" w:space="0" w:color="000000"/>
+              <w:left w:val="single" w:sz="4" w:space="0" w:color="000000"/>
               <w:bottom w:val="single" w:sz="4" w:space="0" w:color="000000"/>
-              <w:end w:val="single" w:sz="4" w:space="0" w:color="000000"/>
-            </w:tcBorders>
-          </w:tcPr>
-          <w:p>
-            <w:pPr>
-              <w:pStyle w:val="Normal"/>
-              <w:spacing w:lineRule="exact" w:line="260"/>
+              <w:right w:val="single" w:sz="4" w:space="0" w:color="000000"/>
+            </w:tcBorders>
+          </w:tcPr>
+          <w:p>
+            <w:pPr>
+              <w:spacing w:line="260" w:lineRule="exact"/>
               <w:rPr>
                 <w:sz w:val="22"/>
                 <w:szCs w:val="22"/>
@@ -153,19 +134,19 @@
             <w:tcW w:w="7083" w:type="dxa"/>
             <w:tcBorders>
               <w:top w:val="single" w:sz="4" w:space="0" w:color="000000"/>
-              <w:start w:val="single" w:sz="4" w:space="0" w:color="000000"/>
+              <w:left w:val="single" w:sz="4" w:space="0" w:color="000000"/>
               <w:bottom w:val="single" w:sz="4" w:space="0" w:color="000000"/>
-              <w:end w:val="single" w:sz="4" w:space="0" w:color="000000"/>
-            </w:tcBorders>
-          </w:tcPr>
-          <w:p>
-            <w:pPr>
-              <w:pStyle w:val="ListParagraph"/>
+              <w:right w:val="single" w:sz="4" w:space="0" w:color="000000"/>
+            </w:tcBorders>
+          </w:tcPr>
+          <w:p>
+            <w:pPr>
+              <w:pStyle w:val="Listenabsatz"/>
               <w:numPr>
                 <w:ilvl w:val="0"/>
                 <w:numId w:val="1"/>
               </w:numPr>
-              <w:spacing w:lineRule="exact" w:line="260"/>
+              <w:spacing w:line="260" w:lineRule="exact"/>
               <w:rPr>
                 <w:sz w:val="20"/>
               </w:rPr>
@@ -179,12 +160,12 @@
           </w:p>
           <w:p>
             <w:pPr>
-              <w:pStyle w:val="ListParagraph"/>
+              <w:pStyle w:val="Listenabsatz"/>
               <w:numPr>
                 <w:ilvl w:val="0"/>
                 <w:numId w:val="1"/>
               </w:numPr>
-              <w:spacing w:lineRule="exact" w:line="260"/>
+              <w:spacing w:line="260" w:lineRule="exact"/>
               <w:rPr>
                 <w:sz w:val="20"/>
               </w:rPr>
@@ -198,12 +179,12 @@
           </w:p>
           <w:p>
             <w:pPr>
-              <w:pStyle w:val="ListParagraph"/>
+              <w:pStyle w:val="Listenabsatz"/>
               <w:numPr>
                 <w:ilvl w:val="0"/>
                 <w:numId w:val="1"/>
               </w:numPr>
-              <w:spacing w:lineRule="exact" w:line="260"/>
+              <w:spacing w:line="260" w:lineRule="exact"/>
               <w:rPr>
                 <w:sz w:val="20"/>
               </w:rPr>
@@ -221,45 +202,52 @@
             <w:tcW w:w="1174" w:type="dxa"/>
             <w:tcBorders>
               <w:top w:val="single" w:sz="4" w:space="0" w:color="000000"/>
-              <w:start w:val="single" w:sz="4" w:space="0" w:color="000000"/>
+              <w:left w:val="single" w:sz="4" w:space="0" w:color="000000"/>
               <w:bottom w:val="single" w:sz="4" w:space="0" w:color="000000"/>
-              <w:end w:val="single" w:sz="4" w:space="0" w:color="000000"/>
-            </w:tcBorders>
-          </w:tcPr>
-          <w:p>
-            <w:pPr>
-              <w:pStyle w:val="Normal"/>
-              <w:spacing w:lineRule="exact" w:line="260"/>
-              <w:rPr>
-                <w:sz w:val="20"/>
-              </w:rPr>
-            </w:pPr>
-            <w:r>
-              <w:rPr>
-                <w:sz w:val="20"/>
-              </w:rPr>
+              <w:right w:val="single" w:sz="4" w:space="0" w:color="000000"/>
+            </w:tcBorders>
+          </w:tcPr>
+          <w:p>
+            <w:pPr>
+              <w:spacing w:line="260" w:lineRule="exact"/>
+              <w:rPr>
+                <w:sz w:val="20"/>
+              </w:rPr>
+            </w:pPr>
+          </w:p>
+          <w:p>
+            <w:pPr>
+              <w:spacing w:line="260" w:lineRule="exact"/>
+              <w:rPr>
+                <w:sz w:val="20"/>
+              </w:rPr>
+            </w:pPr>
+            <w:r>
+              <w:rPr>
+                <w:sz w:val="20"/>
+              </w:rPr>
+              <w:t>6</w:t>
             </w:r>
           </w:p>
         </w:tc>
       </w:tr>
       <w:tr>
         <w:trPr>
-          <w:trHeight w:val="139" w:hRule="atLeast"/>
+          <w:trHeight w:val="139"/>
         </w:trPr>
         <w:tc>
           <w:tcPr>
             <w:tcW w:w="1383" w:type="dxa"/>
             <w:tcBorders>
               <w:top w:val="single" w:sz="4" w:space="0" w:color="000000"/>
-              <w:start w:val="single" w:sz="4" w:space="0" w:color="000000"/>
+              <w:left w:val="single" w:sz="4" w:space="0" w:color="000000"/>
               <w:bottom w:val="single" w:sz="4" w:space="0" w:color="000000"/>
-              <w:end w:val="single" w:sz="4" w:space="0" w:color="000000"/>
-            </w:tcBorders>
-          </w:tcPr>
-          <w:p>
-            <w:pPr>
-              <w:pStyle w:val="Normal"/>
-              <w:spacing w:lineRule="exact" w:line="260"/>
+              <w:right w:val="single" w:sz="4" w:space="0" w:color="000000"/>
+            </w:tcBorders>
+          </w:tcPr>
+          <w:p>
+            <w:pPr>
+              <w:spacing w:line="260" w:lineRule="exact"/>
               <w:rPr>
                 <w:sz w:val="22"/>
                 <w:szCs w:val="22"/>
@@ -279,19 +267,19 @@
             <w:tcW w:w="7083" w:type="dxa"/>
             <w:tcBorders>
               <w:top w:val="single" w:sz="4" w:space="0" w:color="000000"/>
-              <w:start w:val="single" w:sz="4" w:space="0" w:color="000000"/>
+              <w:left w:val="single" w:sz="4" w:space="0" w:color="000000"/>
               <w:bottom w:val="single" w:sz="4" w:space="0" w:color="000000"/>
-              <w:end w:val="single" w:sz="4" w:space="0" w:color="000000"/>
-            </w:tcBorders>
-          </w:tcPr>
-          <w:p>
-            <w:pPr>
-              <w:pStyle w:val="ListParagraph"/>
+              <w:right w:val="single" w:sz="4" w:space="0" w:color="000000"/>
+            </w:tcBorders>
+          </w:tcPr>
+          <w:p>
+            <w:pPr>
+              <w:pStyle w:val="Listenabsatz"/>
               <w:numPr>
                 <w:ilvl w:val="0"/>
                 <w:numId w:val="1"/>
               </w:numPr>
-              <w:spacing w:lineRule="exact" w:line="260"/>
+              <w:spacing w:line="260" w:lineRule="exact"/>
               <w:rPr>
                 <w:sz w:val="20"/>
               </w:rPr>
@@ -305,65 +293,73 @@
           </w:p>
           <w:p>
             <w:pPr>
-              <w:pStyle w:val="ListParagraph"/>
+              <w:pStyle w:val="Listenabsatz"/>
               <w:numPr>
                 <w:ilvl w:val="0"/>
                 <w:numId w:val="1"/>
               </w:numPr>
-              <w:spacing w:lineRule="exact" w:line="260"/>
-              <w:rPr>
-                <w:sz w:val="20"/>
-              </w:rPr>
-            </w:pPr>
-            <w:r>
-              <w:rPr>
-                <w:sz w:val="20"/>
-              </w:rPr>
-              <w:t>Englisch →  Referat Vorbereitung</w:t>
-            </w:r>
-          </w:p>
-          <w:p>
-            <w:pPr>
-              <w:pStyle w:val="ListParagraph"/>
+              <w:spacing w:line="260" w:lineRule="exact"/>
+              <w:rPr>
+                <w:sz w:val="20"/>
+              </w:rPr>
+            </w:pPr>
+            <w:r>
+              <w:rPr>
+                <w:sz w:val="20"/>
+              </w:rPr>
+              <w:t>Englisch → Referat Vorbereitung</w:t>
+            </w:r>
+          </w:p>
+          <w:p>
+            <w:pPr>
+              <w:pStyle w:val="Listenabsatz"/>
               <w:numPr>
                 <w:ilvl w:val="0"/>
                 <w:numId w:val="1"/>
               </w:numPr>
-              <w:spacing w:lineRule="exact" w:line="260"/>
-              <w:rPr>
-                <w:sz w:val="20"/>
-              </w:rPr>
-            </w:pPr>
-            <w:r>
-              <w:rPr>
-                <w:sz w:val="20"/>
-              </w:rPr>
-              <w:t xml:space="preserve">ITP → Referate Retro und Produktpräsentation, </w:t>
-            </w:r>
-            <w:r>
-              <w:rPr>
-                <w:sz w:val="20"/>
-              </w:rPr>
-              <w:t>Pricing Modelle Arbeitsblatt</w:t>
-            </w:r>
-          </w:p>
-          <w:p>
-            <w:pPr>
-              <w:pStyle w:val="ListParagraph"/>
+              <w:spacing w:line="260" w:lineRule="exact"/>
+              <w:rPr>
+                <w:sz w:val="20"/>
+              </w:rPr>
+            </w:pPr>
+            <w:r>
+              <w:rPr>
+                <w:sz w:val="20"/>
+              </w:rPr>
+              <w:t>ITP → Referate Retro und Produktpräsentation, Pricing Modelle Arbeitsblatt</w:t>
+            </w:r>
+          </w:p>
+          <w:p>
+            <w:pPr>
+              <w:pStyle w:val="Listenabsatz"/>
               <w:numPr>
                 <w:ilvl w:val="0"/>
                 <w:numId w:val="1"/>
               </w:numPr>
-              <w:spacing w:lineRule="exact" w:line="260"/>
-              <w:rPr>
-                <w:sz w:val="20"/>
-              </w:rPr>
-            </w:pPr>
-            <w:r>
-              <w:rPr>
-                <w:sz w:val="20"/>
-              </w:rPr>
-              <w:t>PuG → Kurzarbeit Rückgabe, Arbeitsblatt Konjukturschankungen</w:t>
+              <w:spacing w:line="260" w:lineRule="exact"/>
+              <w:rPr>
+                <w:sz w:val="20"/>
+              </w:rPr>
+            </w:pPr>
+            <w:proofErr w:type="spellStart"/>
+            <w:r>
+              <w:rPr>
+                <w:sz w:val="20"/>
+              </w:rPr>
+              <w:t>PuG</w:t>
+            </w:r>
+            <w:proofErr w:type="spellEnd"/>
+            <w:r>
+              <w:rPr>
+                <w:sz w:val="20"/>
+              </w:rPr>
+              <w:t xml:space="preserve"> → Kurzarbeit Rückgabe, Arbeitsblatt </w:t>
+            </w:r>
+            <w:r>
+              <w:rPr>
+                <w:sz w:val="20"/>
+              </w:rPr>
+              <w:t>Konjunkturschwankungen</w:t>
             </w:r>
           </w:p>
         </w:tc>
@@ -372,45 +368,60 @@
             <w:tcW w:w="1174" w:type="dxa"/>
             <w:tcBorders>
               <w:top w:val="single" w:sz="4" w:space="0" w:color="000000"/>
-              <w:start w:val="single" w:sz="4" w:space="0" w:color="000000"/>
+              <w:left w:val="single" w:sz="4" w:space="0" w:color="000000"/>
               <w:bottom w:val="single" w:sz="4" w:space="0" w:color="000000"/>
-              <w:end w:val="single" w:sz="4" w:space="0" w:color="000000"/>
-            </w:tcBorders>
-          </w:tcPr>
-          <w:p>
-            <w:pPr>
-              <w:pStyle w:val="Normal"/>
-              <w:spacing w:lineRule="exact" w:line="260"/>
-              <w:rPr>
-                <w:sz w:val="20"/>
-              </w:rPr>
-            </w:pPr>
-            <w:r>
-              <w:rPr>
-                <w:sz w:val="20"/>
-              </w:rPr>
+              <w:right w:val="single" w:sz="4" w:space="0" w:color="000000"/>
+            </w:tcBorders>
+          </w:tcPr>
+          <w:p>
+            <w:pPr>
+              <w:spacing w:line="260" w:lineRule="exact"/>
+              <w:rPr>
+                <w:sz w:val="20"/>
+              </w:rPr>
+            </w:pPr>
+          </w:p>
+          <w:p>
+            <w:pPr>
+              <w:spacing w:line="260" w:lineRule="exact"/>
+              <w:rPr>
+                <w:sz w:val="20"/>
+              </w:rPr>
+            </w:pPr>
+          </w:p>
+          <w:p>
+            <w:pPr>
+              <w:spacing w:line="260" w:lineRule="exact"/>
+              <w:rPr>
+                <w:sz w:val="20"/>
+              </w:rPr>
+            </w:pPr>
+            <w:r>
+              <w:rPr>
+                <w:sz w:val="20"/>
+              </w:rPr>
+              <w:t>6</w:t>
             </w:r>
           </w:p>
         </w:tc>
       </w:tr>
       <w:tr>
         <w:trPr>
-          <w:trHeight w:val="56" w:hRule="atLeast"/>
+          <w:trHeight w:val="56"/>
         </w:trPr>
         <w:tc>
           <w:tcPr>
             <w:tcW w:w="1383" w:type="dxa"/>
             <w:tcBorders>
               <w:top w:val="single" w:sz="4" w:space="0" w:color="000000"/>
-              <w:start w:val="single" w:sz="4" w:space="0" w:color="000000"/>
+              <w:left w:val="single" w:sz="4" w:space="0" w:color="000000"/>
               <w:bottom w:val="single" w:sz="4" w:space="0" w:color="000000"/>
-              <w:end w:val="single" w:sz="4" w:space="0" w:color="000000"/>
-            </w:tcBorders>
-          </w:tcPr>
-          <w:p>
-            <w:pPr>
-              <w:pStyle w:val="Normal"/>
-              <w:spacing w:lineRule="exact" w:line="260"/>
+              <w:right w:val="single" w:sz="4" w:space="0" w:color="000000"/>
+            </w:tcBorders>
+          </w:tcPr>
+          <w:p>
+            <w:pPr>
+              <w:spacing w:line="260" w:lineRule="exact"/>
               <w:rPr>
                 <w:sz w:val="22"/>
                 <w:szCs w:val="22"/>
@@ -430,109 +441,93 @@
             <w:tcW w:w="7083" w:type="dxa"/>
             <w:tcBorders>
               <w:top w:val="single" w:sz="4" w:space="0" w:color="000000"/>
-              <w:start w:val="single" w:sz="4" w:space="0" w:color="000000"/>
+              <w:left w:val="single" w:sz="4" w:space="0" w:color="000000"/>
               <w:bottom w:val="single" w:sz="4" w:space="0" w:color="000000"/>
-              <w:end w:val="single" w:sz="4" w:space="0" w:color="000000"/>
-            </w:tcBorders>
-          </w:tcPr>
-          <w:p>
-            <w:pPr>
-              <w:pStyle w:val="ListParagraph"/>
+              <w:right w:val="single" w:sz="4" w:space="0" w:color="000000"/>
+            </w:tcBorders>
+          </w:tcPr>
+          <w:p>
+            <w:pPr>
+              <w:pStyle w:val="Listenabsatz"/>
               <w:numPr>
                 <w:ilvl w:val="0"/>
                 <w:numId w:val="1"/>
               </w:numPr>
-              <w:spacing w:lineRule="exact" w:line="260"/>
-              <w:rPr>
-                <w:sz w:val="20"/>
-              </w:rPr>
-            </w:pPr>
-            <w:r>
-              <w:rPr>
-                <w:sz w:val="20"/>
-              </w:rPr>
-              <w:t xml:space="preserve">FU-ITab → </w:t>
-            </w:r>
-            <w:r>
-              <w:rPr>
-                <w:sz w:val="20"/>
-              </w:rPr>
-              <w:t>Einführung in GNS3 und Putty, dazu Aufgaben erledigt</w:t>
-            </w:r>
-          </w:p>
-          <w:p>
-            <w:pPr>
-              <w:pStyle w:val="ListParagraph"/>
+              <w:spacing w:line="260" w:lineRule="exact"/>
+              <w:rPr>
+                <w:sz w:val="20"/>
+              </w:rPr>
+            </w:pPr>
+            <w:r>
+              <w:rPr>
+                <w:sz w:val="20"/>
+              </w:rPr>
+              <w:t>FU-ITab → Einführung in GNS3 und Putty, dazu Aufgaben erledigt</w:t>
+            </w:r>
+          </w:p>
+          <w:p>
+            <w:pPr>
+              <w:pStyle w:val="Listenabsatz"/>
               <w:numPr>
                 <w:ilvl w:val="0"/>
                 <w:numId w:val="1"/>
               </w:numPr>
-              <w:spacing w:lineRule="exact" w:line="260"/>
-              <w:rPr>
-                <w:sz w:val="20"/>
-              </w:rPr>
-            </w:pPr>
-            <w:r>
-              <w:rPr>
-                <w:sz w:val="20"/>
-              </w:rPr>
-              <w:t xml:space="preserve">ITP → Referate Retro und Produktpräsentation, </w:t>
-            </w:r>
-            <w:r>
-              <w:rPr>
-                <w:sz w:val="20"/>
-              </w:rPr>
-              <w:t>Pricing Modelle Arbeitsblatt weitergeführt</w:t>
-            </w:r>
-          </w:p>
-          <w:p>
-            <w:pPr>
-              <w:pStyle w:val="ListParagraph"/>
+              <w:spacing w:line="260" w:lineRule="exact"/>
+              <w:rPr>
+                <w:sz w:val="20"/>
+              </w:rPr>
+            </w:pPr>
+            <w:r>
+              <w:rPr>
+                <w:sz w:val="20"/>
+              </w:rPr>
+              <w:t>ITP → Referate Retro und Produktpräsentation, Pricing Modelle Arbeitsblatt weitergeführt</w:t>
+            </w:r>
+          </w:p>
+          <w:p>
+            <w:pPr>
+              <w:pStyle w:val="Listenabsatz"/>
               <w:numPr>
                 <w:ilvl w:val="0"/>
                 <w:numId w:val="1"/>
               </w:numPr>
-              <w:spacing w:lineRule="exact" w:line="260"/>
-              <w:rPr>
-                <w:sz w:val="20"/>
-              </w:rPr>
-            </w:pPr>
-            <w:r>
-              <w:rPr>
-                <w:sz w:val="20"/>
-              </w:rPr>
-              <w:t xml:space="preserve">PuG → </w:t>
-            </w:r>
-            <w:r>
-              <w:rPr>
-                <w:sz w:val="20"/>
-              </w:rPr>
-              <w:t>Konjunktur zu Ende gemacht, Einführung in Eurozone</w:t>
-            </w:r>
-          </w:p>
-          <w:p>
-            <w:pPr>
-              <w:pStyle w:val="ListParagraph"/>
+              <w:spacing w:line="260" w:lineRule="exact"/>
+              <w:rPr>
+                <w:sz w:val="20"/>
+              </w:rPr>
+            </w:pPr>
+            <w:proofErr w:type="spellStart"/>
+            <w:r>
+              <w:rPr>
+                <w:sz w:val="20"/>
+              </w:rPr>
+              <w:t>PuG</w:t>
+            </w:r>
+            <w:proofErr w:type="spellEnd"/>
+            <w:r>
+              <w:rPr>
+                <w:sz w:val="20"/>
+              </w:rPr>
+              <w:t xml:space="preserve"> → Konjunktur zu Ende gemacht, Einführung in Eurozone</w:t>
+            </w:r>
+          </w:p>
+          <w:p>
+            <w:pPr>
+              <w:pStyle w:val="Listenabsatz"/>
               <w:numPr>
                 <w:ilvl w:val="0"/>
                 <w:numId w:val="1"/>
               </w:numPr>
-              <w:spacing w:lineRule="exact" w:line="260"/>
-              <w:rPr>
-                <w:sz w:val="20"/>
-              </w:rPr>
-            </w:pPr>
-            <w:r>
-              <w:rPr>
-                <w:sz w:val="20"/>
-              </w:rPr>
-              <w:t xml:space="preserve">ITP → </w:t>
-            </w:r>
-            <w:r>
-              <w:rPr>
-                <w:sz w:val="20"/>
-              </w:rPr>
-              <w:t xml:space="preserve">Präsentationen Verbessern und Karaoke-Präsentation </w:t>
+              <w:spacing w:line="260" w:lineRule="exact"/>
+              <w:rPr>
+                <w:sz w:val="20"/>
+              </w:rPr>
+            </w:pPr>
+            <w:r>
+              <w:rPr>
+                <w:sz w:val="20"/>
+              </w:rPr>
+              <w:t xml:space="preserve">ITP → Präsentationen Verbessern und Karaoke-Präsentation </w:t>
             </w:r>
           </w:p>
         </w:tc>
@@ -541,47 +536,64 @@
             <w:tcW w:w="1174" w:type="dxa"/>
             <w:tcBorders>
               <w:top w:val="single" w:sz="4" w:space="0" w:color="000000"/>
-              <w:start w:val="single" w:sz="4" w:space="0" w:color="000000"/>
+              <w:left w:val="single" w:sz="4" w:space="0" w:color="000000"/>
               <w:bottom w:val="single" w:sz="4" w:space="0" w:color="000000"/>
-              <w:end w:val="single" w:sz="4" w:space="0" w:color="000000"/>
-            </w:tcBorders>
-          </w:tcPr>
-          <w:p>
-            <w:pPr>
-              <w:pStyle w:val="Normal"/>
-              <w:spacing w:lineRule="exact" w:line="260"/>
-              <w:rPr>
-                <w:sz w:val="22"/>
-                <w:szCs w:val="22"/>
-              </w:rPr>
-            </w:pPr>
-            <w:r>
-              <w:rPr>
-                <w:sz w:val="22"/>
-                <w:szCs w:val="22"/>
-              </w:rPr>
+              <w:right w:val="single" w:sz="4" w:space="0" w:color="000000"/>
+            </w:tcBorders>
+          </w:tcPr>
+          <w:p>
+            <w:pPr>
+              <w:spacing w:line="260" w:lineRule="exact"/>
+              <w:rPr>
+                <w:sz w:val="22"/>
+                <w:szCs w:val="22"/>
+              </w:rPr>
+            </w:pPr>
+          </w:p>
+          <w:p>
+            <w:pPr>
+              <w:spacing w:line="260" w:lineRule="exact"/>
+              <w:rPr>
+                <w:sz w:val="22"/>
+                <w:szCs w:val="22"/>
+              </w:rPr>
+            </w:pPr>
+          </w:p>
+          <w:p>
+            <w:pPr>
+              <w:spacing w:line="260" w:lineRule="exact"/>
+              <w:rPr>
+                <w:sz w:val="22"/>
+                <w:szCs w:val="22"/>
+              </w:rPr>
+            </w:pPr>
+            <w:r>
+              <w:rPr>
+                <w:sz w:val="22"/>
+                <w:szCs w:val="22"/>
+              </w:rPr>
+              <w:t>10</w:t>
             </w:r>
           </w:p>
         </w:tc>
       </w:tr>
       <w:tr>
         <w:trPr>
-          <w:trHeight w:val="96" w:hRule="atLeast"/>
+          <w:trHeight w:val="96"/>
         </w:trPr>
         <w:tc>
           <w:tcPr>
             <w:tcW w:w="1383" w:type="dxa"/>
             <w:tcBorders>
               <w:top w:val="single" w:sz="4" w:space="0" w:color="000000"/>
-              <w:start w:val="single" w:sz="4" w:space="0" w:color="000000"/>
+              <w:left w:val="single" w:sz="4" w:space="0" w:color="000000"/>
               <w:bottom w:val="single" w:sz="4" w:space="0" w:color="000000"/>
-              <w:end w:val="single" w:sz="4" w:space="0" w:color="000000"/>
-            </w:tcBorders>
-          </w:tcPr>
-          <w:p>
-            <w:pPr>
-              <w:pStyle w:val="Normal"/>
-              <w:spacing w:lineRule="exact" w:line="260"/>
+              <w:right w:val="single" w:sz="4" w:space="0" w:color="000000"/>
+            </w:tcBorders>
+          </w:tcPr>
+          <w:p>
+            <w:pPr>
+              <w:spacing w:line="260" w:lineRule="exact"/>
               <w:rPr>
                 <w:sz w:val="22"/>
                 <w:szCs w:val="22"/>
@@ -601,121 +613,85 @@
             <w:tcW w:w="7083" w:type="dxa"/>
             <w:tcBorders>
               <w:top w:val="single" w:sz="4" w:space="0" w:color="000000"/>
-              <w:start w:val="single" w:sz="4" w:space="0" w:color="000000"/>
+              <w:left w:val="single" w:sz="4" w:space="0" w:color="000000"/>
               <w:bottom w:val="single" w:sz="4" w:space="0" w:color="000000"/>
-              <w:end w:val="single" w:sz="4" w:space="0" w:color="000000"/>
-            </w:tcBorders>
-          </w:tcPr>
-          <w:p>
-            <w:pPr>
-              <w:pStyle w:val="ListParagraph"/>
+              <w:right w:val="single" w:sz="4" w:space="0" w:color="000000"/>
+            </w:tcBorders>
+          </w:tcPr>
+          <w:p>
+            <w:pPr>
+              <w:pStyle w:val="Listenabsatz"/>
               <w:numPr>
                 <w:ilvl w:val="0"/>
                 <w:numId w:val="1"/>
               </w:numPr>
-              <w:spacing w:lineRule="exact" w:line="260"/>
-              <w:rPr>
-                <w:sz w:val="20"/>
-              </w:rPr>
-            </w:pPr>
-            <w:r>
-              <w:rPr>
-                <w:sz w:val="20"/>
-              </w:rPr>
-              <w:t xml:space="preserve">FU-IT → </w:t>
-            </w:r>
-            <w:r>
-              <w:rPr>
-                <w:sz w:val="20"/>
-              </w:rPr>
-              <w:t>Schulaufgabe geschrieben</w:t>
-            </w:r>
-          </w:p>
-          <w:p>
-            <w:pPr>
-              <w:pStyle w:val="ListParagraph"/>
+              <w:spacing w:line="260" w:lineRule="exact"/>
+              <w:rPr>
+                <w:sz w:val="20"/>
+              </w:rPr>
+            </w:pPr>
+            <w:r>
+              <w:rPr>
+                <w:sz w:val="20"/>
+              </w:rPr>
+              <w:t>FU-IT → Schulaufgabe geschrieben</w:t>
+            </w:r>
+          </w:p>
+          <w:p>
+            <w:pPr>
+              <w:pStyle w:val="Listenabsatz"/>
               <w:numPr>
                 <w:ilvl w:val="0"/>
                 <w:numId w:val="1"/>
               </w:numPr>
-              <w:spacing w:lineRule="exact" w:line="260"/>
-              <w:rPr>
-                <w:sz w:val="20"/>
-              </w:rPr>
-            </w:pPr>
-            <w:r>
-              <w:rPr>
-                <w:sz w:val="20"/>
-              </w:rPr>
-              <w:t xml:space="preserve">Deutsch → </w:t>
-            </w:r>
-            <w:r>
-              <w:rPr>
-                <w:sz w:val="20"/>
-              </w:rPr>
-              <w:t>Pitch zugehört und Vorbereitung</w:t>
-            </w:r>
-          </w:p>
-          <w:p>
-            <w:pPr>
-              <w:pStyle w:val="ListParagraph"/>
+              <w:spacing w:line="260" w:lineRule="exact"/>
+              <w:rPr>
+                <w:sz w:val="20"/>
+              </w:rPr>
+            </w:pPr>
+            <w:r>
+              <w:rPr>
+                <w:sz w:val="20"/>
+              </w:rPr>
+              <w:t>Deutsch → Pitch zugehört und Vorbereitung</w:t>
+            </w:r>
+          </w:p>
+          <w:p>
+            <w:pPr>
+              <w:pStyle w:val="Listenabsatz"/>
               <w:numPr>
                 <w:ilvl w:val="0"/>
                 <w:numId w:val="1"/>
               </w:numPr>
-              <w:spacing w:lineRule="exact" w:line="260"/>
-              <w:rPr>
-                <w:sz w:val="20"/>
-              </w:rPr>
-            </w:pPr>
-            <w:r>
-              <w:rPr>
-                <w:sz w:val="20"/>
-              </w:rPr>
-              <w:t xml:space="preserve">FU-IT → </w:t>
-            </w:r>
-            <w:r>
-              <w:rPr>
-                <w:sz w:val="20"/>
-              </w:rPr>
-              <w:t>Organisationsgespräch und Wiederholung für Schulaufgabe</w:t>
-            </w:r>
-          </w:p>
-          <w:p>
-            <w:pPr>
-              <w:pStyle w:val="ListParagraph"/>
+              <w:spacing w:line="260" w:lineRule="exact"/>
+              <w:rPr>
+                <w:sz w:val="20"/>
+              </w:rPr>
+            </w:pPr>
+            <w:r>
+              <w:rPr>
+                <w:sz w:val="20"/>
+              </w:rPr>
+              <w:t>FU-IT → Organisationsgespräch und Wiederholung für Schulaufgabe</w:t>
+            </w:r>
+          </w:p>
+          <w:p>
+            <w:pPr>
+              <w:pStyle w:val="Listenabsatz"/>
               <w:numPr>
                 <w:ilvl w:val="0"/>
                 <w:numId w:val="1"/>
               </w:numPr>
-              <w:spacing w:lineRule="exact" w:line="260"/>
-              <w:rPr>
-                <w:sz w:val="20"/>
-              </w:rPr>
-            </w:pPr>
-            <w:r>
-              <w:rPr>
-                <w:sz w:val="20"/>
-              </w:rPr>
-              <w:t>FU-I</w:t>
-            </w:r>
-            <w:r>
-              <w:rPr>
-                <w:sz w:val="20"/>
-              </w:rPr>
-              <w:t>T</w:t>
-            </w:r>
-            <w:r>
-              <w:rPr>
-                <w:sz w:val="20"/>
-              </w:rPr>
-              <w:t xml:space="preserve">ab → </w:t>
-            </w:r>
-            <w:r>
-              <w:rPr>
-                <w:sz w:val="20"/>
-              </w:rPr>
-              <w:t>Einführung in Docker</w:t>
+              <w:spacing w:line="260" w:lineRule="exact"/>
+              <w:rPr>
+                <w:sz w:val="20"/>
+              </w:rPr>
+            </w:pPr>
+            <w:r>
+              <w:rPr>
+                <w:sz w:val="20"/>
+              </w:rPr>
+              <w:t>FU-ITab → Einführung in Docker</w:t>
             </w:r>
           </w:p>
         </w:tc>
@@ -724,47 +700,55 @@
             <w:tcW w:w="1174" w:type="dxa"/>
             <w:tcBorders>
               <w:top w:val="single" w:sz="4" w:space="0" w:color="000000"/>
-              <w:start w:val="single" w:sz="4" w:space="0" w:color="000000"/>
+              <w:left w:val="single" w:sz="4" w:space="0" w:color="000000"/>
               <w:bottom w:val="single" w:sz="4" w:space="0" w:color="000000"/>
-              <w:end w:val="single" w:sz="4" w:space="0" w:color="000000"/>
-            </w:tcBorders>
-          </w:tcPr>
-          <w:p>
-            <w:pPr>
-              <w:pStyle w:val="Normal"/>
-              <w:spacing w:lineRule="exact" w:line="260"/>
-              <w:rPr>
-                <w:sz w:val="22"/>
-                <w:szCs w:val="22"/>
-              </w:rPr>
-            </w:pPr>
-            <w:r>
-              <w:rPr>
-                <w:sz w:val="22"/>
-                <w:szCs w:val="22"/>
-              </w:rPr>
+              <w:right w:val="single" w:sz="4" w:space="0" w:color="000000"/>
+            </w:tcBorders>
+          </w:tcPr>
+          <w:p>
+            <w:pPr>
+              <w:spacing w:line="260" w:lineRule="exact"/>
+              <w:rPr>
+                <w:sz w:val="22"/>
+                <w:szCs w:val="22"/>
+              </w:rPr>
+            </w:pPr>
+          </w:p>
+          <w:p>
+            <w:pPr>
+              <w:spacing w:line="260" w:lineRule="exact"/>
+              <w:rPr>
+                <w:sz w:val="22"/>
+                <w:szCs w:val="22"/>
+              </w:rPr>
+            </w:pPr>
+            <w:r>
+              <w:rPr>
+                <w:sz w:val="22"/>
+                <w:szCs w:val="22"/>
+              </w:rPr>
+              <w:t>9</w:t>
             </w:r>
           </w:p>
         </w:tc>
       </w:tr>
       <w:tr>
         <w:trPr>
-          <w:trHeight w:val="195" w:hRule="atLeast"/>
+          <w:trHeight w:val="195"/>
         </w:trPr>
         <w:tc>
           <w:tcPr>
             <w:tcW w:w="1383" w:type="dxa"/>
             <w:tcBorders>
               <w:top w:val="single" w:sz="4" w:space="0" w:color="000000"/>
-              <w:start w:val="single" w:sz="4" w:space="0" w:color="000000"/>
+              <w:left w:val="single" w:sz="4" w:space="0" w:color="000000"/>
               <w:bottom w:val="single" w:sz="4" w:space="0" w:color="000000"/>
-              <w:end w:val="single" w:sz="4" w:space="0" w:color="000000"/>
-            </w:tcBorders>
-          </w:tcPr>
-          <w:p>
-            <w:pPr>
-              <w:pStyle w:val="Normal"/>
-              <w:spacing w:lineRule="exact" w:line="260"/>
+              <w:right w:val="single" w:sz="4" w:space="0" w:color="000000"/>
+            </w:tcBorders>
+          </w:tcPr>
+          <w:p>
+            <w:pPr>
+              <w:spacing w:line="260" w:lineRule="exact"/>
               <w:rPr>
                 <w:sz w:val="22"/>
                 <w:szCs w:val="22"/>
@@ -784,109 +768,105 @@
             <w:tcW w:w="7083" w:type="dxa"/>
             <w:tcBorders>
               <w:top w:val="single" w:sz="4" w:space="0" w:color="000000"/>
-              <w:start w:val="single" w:sz="4" w:space="0" w:color="000000"/>
+              <w:left w:val="single" w:sz="4" w:space="0" w:color="000000"/>
               <w:bottom w:val="single" w:sz="4" w:space="0" w:color="000000"/>
-              <w:end w:val="single" w:sz="4" w:space="0" w:color="000000"/>
-            </w:tcBorders>
-          </w:tcPr>
-          <w:p>
-            <w:pPr>
-              <w:pStyle w:val="ListParagraph"/>
+              <w:right w:val="single" w:sz="4" w:space="0" w:color="000000"/>
+            </w:tcBorders>
+          </w:tcPr>
+          <w:p>
+            <w:pPr>
+              <w:pStyle w:val="Listenabsatz"/>
               <w:numPr>
                 <w:ilvl w:val="0"/>
                 <w:numId w:val="1"/>
               </w:numPr>
-              <w:spacing w:lineRule="exact" w:line="260"/>
-              <w:rPr>
-                <w:sz w:val="20"/>
-              </w:rPr>
-            </w:pPr>
-            <w:r>
-              <w:rPr>
-                <w:sz w:val="20"/>
-              </w:rPr>
-              <w:t>FU-IT →</w:t>
-            </w:r>
-            <w:r>
-              <w:rPr>
-                <w:sz w:val="20"/>
-              </w:rPr>
-              <w:t>Schulaufgabe rausbekommen und besprochen, AP2 Aufgaben</w:t>
-            </w:r>
-          </w:p>
-          <w:p>
-            <w:pPr>
-              <w:pStyle w:val="ListParagraph"/>
+              <w:spacing w:line="260" w:lineRule="exact"/>
+              <w:rPr>
+                <w:sz w:val="20"/>
+              </w:rPr>
+            </w:pPr>
+            <w:r>
+              <w:rPr>
+                <w:sz w:val="20"/>
+              </w:rPr>
+              <w:t>FU-IT →Schulaufgabe rausbekommen und besprochen, AP2 Aufgaben</w:t>
+            </w:r>
+          </w:p>
+          <w:p>
+            <w:pPr>
+              <w:pStyle w:val="Listenabsatz"/>
               <w:numPr>
                 <w:ilvl w:val="0"/>
                 <w:numId w:val="1"/>
               </w:numPr>
-              <w:spacing w:lineRule="exact" w:line="260"/>
-              <w:rPr>
-                <w:sz w:val="20"/>
-              </w:rPr>
-            </w:pPr>
-            <w:r>
-              <w:rPr>
-                <w:sz w:val="20"/>
-              </w:rPr>
-              <w:t xml:space="preserve">Deutsch → </w:t>
-            </w:r>
-            <w:r>
-              <w:rPr>
-                <w:sz w:val="20"/>
-              </w:rPr>
-              <w:t>Pitch gehalten</w:t>
-            </w:r>
-          </w:p>
-          <w:p>
-            <w:pPr>
-              <w:pStyle w:val="ListParagraph"/>
+              <w:spacing w:line="260" w:lineRule="exact"/>
+              <w:rPr>
+                <w:sz w:val="20"/>
+              </w:rPr>
+            </w:pPr>
+            <w:r>
+              <w:rPr>
+                <w:sz w:val="20"/>
+              </w:rPr>
+              <w:t>Deutsch → Pitch gehalten</w:t>
+            </w:r>
+          </w:p>
+          <w:p>
+            <w:pPr>
+              <w:pStyle w:val="Listenabsatz"/>
               <w:numPr>
                 <w:ilvl w:val="0"/>
                 <w:numId w:val="1"/>
               </w:numPr>
-              <w:spacing w:lineRule="exact" w:line="260"/>
-              <w:rPr>
-                <w:sz w:val="20"/>
-              </w:rPr>
-            </w:pPr>
-            <w:r>
-              <w:rPr>
-                <w:sz w:val="20"/>
-              </w:rPr>
-              <w:t xml:space="preserve">ITP → </w:t>
-            </w:r>
-            <w:r>
-              <w:rPr>
-                <w:sz w:val="20"/>
-              </w:rPr>
-              <w:t>Kurzarbeit rückgabe, Preisarten und Berechnungen</w:t>
-            </w:r>
-          </w:p>
-          <w:p>
-            <w:pPr>
-              <w:pStyle w:val="ListParagraph"/>
+              <w:spacing w:line="260" w:lineRule="exact"/>
+              <w:rPr>
+                <w:sz w:val="20"/>
+              </w:rPr>
+            </w:pPr>
+            <w:r>
+              <w:rPr>
+                <w:sz w:val="20"/>
+              </w:rPr>
+              <w:t xml:space="preserve">ITP → Kurzarbeit </w:t>
+            </w:r>
+            <w:r>
+              <w:rPr>
+                <w:sz w:val="20"/>
+              </w:rPr>
+              <w:t>Rückgabe</w:t>
+            </w:r>
+            <w:r>
+              <w:rPr>
+                <w:sz w:val="20"/>
+              </w:rPr>
+              <w:t>, Preisarten und Berechnungen</w:t>
+            </w:r>
+          </w:p>
+          <w:p>
+            <w:pPr>
+              <w:pStyle w:val="Listenabsatz"/>
               <w:numPr>
                 <w:ilvl w:val="0"/>
                 <w:numId w:val="1"/>
               </w:numPr>
-              <w:spacing w:lineRule="exact" w:line="260"/>
-              <w:rPr>
-                <w:sz w:val="20"/>
-              </w:rPr>
-            </w:pPr>
-            <w:r>
-              <w:rPr>
-                <w:sz w:val="20"/>
-              </w:rPr>
-              <w:t xml:space="preserve">PuG → </w:t>
-            </w:r>
-            <w:r>
-              <w:rPr>
-                <w:sz w:val="20"/>
-              </w:rPr>
-              <w:t>Einführung in Europäische Zentralbank und Europäische System der Zentralbanken</w:t>
+              <w:spacing w:line="260" w:lineRule="exact"/>
+              <w:rPr>
+                <w:sz w:val="20"/>
+              </w:rPr>
+            </w:pPr>
+            <w:proofErr w:type="spellStart"/>
+            <w:r>
+              <w:rPr>
+                <w:sz w:val="20"/>
+              </w:rPr>
+              <w:t>PuG</w:t>
+            </w:r>
+            <w:proofErr w:type="spellEnd"/>
+            <w:r>
+              <w:rPr>
+                <w:sz w:val="20"/>
+              </w:rPr>
+              <w:t xml:space="preserve"> → Einführung in Europäische Zentralbank und Europäische System der Zentralbanken</w:t>
             </w:r>
           </w:p>
         </w:tc>
@@ -895,47 +875,64 @@
             <w:tcW w:w="1174" w:type="dxa"/>
             <w:tcBorders>
               <w:top w:val="single" w:sz="4" w:space="0" w:color="000000"/>
-              <w:start w:val="single" w:sz="4" w:space="0" w:color="000000"/>
+              <w:left w:val="single" w:sz="4" w:space="0" w:color="000000"/>
               <w:bottom w:val="single" w:sz="4" w:space="0" w:color="000000"/>
-              <w:end w:val="single" w:sz="4" w:space="0" w:color="000000"/>
-            </w:tcBorders>
-          </w:tcPr>
-          <w:p>
-            <w:pPr>
-              <w:pStyle w:val="Normal"/>
-              <w:spacing w:lineRule="exact" w:line="260"/>
-              <w:rPr>
-                <w:sz w:val="22"/>
-                <w:szCs w:val="22"/>
-              </w:rPr>
-            </w:pPr>
-            <w:r>
-              <w:rPr>
-                <w:sz w:val="22"/>
-                <w:szCs w:val="22"/>
-              </w:rPr>
+              <w:right w:val="single" w:sz="4" w:space="0" w:color="000000"/>
+            </w:tcBorders>
+          </w:tcPr>
+          <w:p>
+            <w:pPr>
+              <w:spacing w:line="260" w:lineRule="exact"/>
+              <w:rPr>
+                <w:sz w:val="22"/>
+                <w:szCs w:val="22"/>
+              </w:rPr>
+            </w:pPr>
+          </w:p>
+          <w:p>
+            <w:pPr>
+              <w:spacing w:line="260" w:lineRule="exact"/>
+              <w:rPr>
+                <w:sz w:val="22"/>
+                <w:szCs w:val="22"/>
+              </w:rPr>
+            </w:pPr>
+          </w:p>
+          <w:p>
+            <w:pPr>
+              <w:spacing w:line="260" w:lineRule="exact"/>
+              <w:rPr>
+                <w:sz w:val="22"/>
+                <w:szCs w:val="22"/>
+              </w:rPr>
+            </w:pPr>
+            <w:r>
+              <w:rPr>
+                <w:sz w:val="22"/>
+                <w:szCs w:val="22"/>
+              </w:rPr>
+              <w:t>5</w:t>
             </w:r>
           </w:p>
         </w:tc>
       </w:tr>
       <w:tr>
         <w:trPr>
-          <w:trHeight w:val="102" w:hRule="atLeast"/>
+          <w:trHeight w:val="102"/>
         </w:trPr>
         <w:tc>
           <w:tcPr>
             <w:tcW w:w="1383" w:type="dxa"/>
             <w:tcBorders>
               <w:top w:val="single" w:sz="4" w:space="0" w:color="000000"/>
-              <w:start w:val="single" w:sz="4" w:space="0" w:color="000000"/>
+              <w:left w:val="single" w:sz="4" w:space="0" w:color="000000"/>
               <w:bottom w:val="single" w:sz="4" w:space="0" w:color="000000"/>
-              <w:end w:val="single" w:sz="4" w:space="0" w:color="000000"/>
-            </w:tcBorders>
-          </w:tcPr>
-          <w:p>
-            <w:pPr>
-              <w:pStyle w:val="Normal"/>
-              <w:spacing w:lineRule="exact" w:line="260"/>
+              <w:right w:val="single" w:sz="4" w:space="0" w:color="000000"/>
+            </w:tcBorders>
+          </w:tcPr>
+          <w:p>
+            <w:pPr>
+              <w:spacing w:line="260" w:lineRule="exact"/>
               <w:rPr>
                 <w:sz w:val="22"/>
                 <w:szCs w:val="22"/>
@@ -955,26 +952,19 @@
             <w:tcW w:w="7083" w:type="dxa"/>
             <w:tcBorders>
               <w:top w:val="single" w:sz="4" w:space="0" w:color="000000"/>
-              <w:start w:val="single" w:sz="4" w:space="0" w:color="000000"/>
+              <w:left w:val="single" w:sz="4" w:space="0" w:color="000000"/>
               <w:bottom w:val="single" w:sz="4" w:space="0" w:color="000000"/>
-              <w:end w:val="single" w:sz="4" w:space="0" w:color="000000"/>
-            </w:tcBorders>
-          </w:tcPr>
-          <w:p>
-            <w:pPr>
-              <w:pStyle w:val="Normal"/>
-              <w:spacing w:lineRule="exact" w:line="260"/>
-              <w:rPr>
-                <w:sz w:val="22"/>
-                <w:szCs w:val="22"/>
-              </w:rPr>
-            </w:pPr>
-            <w:r>
-              <w:rPr>
-                <w:sz w:val="22"/>
-                <w:szCs w:val="22"/>
-              </w:rPr>
-            </w:r>
+              <w:right w:val="single" w:sz="4" w:space="0" w:color="000000"/>
+            </w:tcBorders>
+          </w:tcPr>
+          <w:p>
+            <w:pPr>
+              <w:spacing w:line="260" w:lineRule="exact"/>
+              <w:rPr>
+                <w:sz w:val="22"/>
+                <w:szCs w:val="22"/>
+              </w:rPr>
+            </w:pPr>
           </w:p>
         </w:tc>
         <w:tc>
@@ -982,32 +972,25 @@
             <w:tcW w:w="1174" w:type="dxa"/>
             <w:tcBorders>
               <w:top w:val="single" w:sz="4" w:space="0" w:color="000000"/>
-              <w:start w:val="single" w:sz="4" w:space="0" w:color="000000"/>
+              <w:left w:val="single" w:sz="4" w:space="0" w:color="000000"/>
               <w:bottom w:val="single" w:sz="4" w:space="0" w:color="000000"/>
-              <w:end w:val="single" w:sz="4" w:space="0" w:color="000000"/>
-            </w:tcBorders>
-          </w:tcPr>
-          <w:p>
-            <w:pPr>
-              <w:pStyle w:val="Normal"/>
-              <w:spacing w:lineRule="exact" w:line="260"/>
-              <w:rPr>
-                <w:sz w:val="22"/>
-                <w:szCs w:val="22"/>
-              </w:rPr>
-            </w:pPr>
-            <w:r>
-              <w:rPr>
-                <w:sz w:val="22"/>
-                <w:szCs w:val="22"/>
-              </w:rPr>
-            </w:r>
+              <w:right w:val="single" w:sz="4" w:space="0" w:color="000000"/>
+            </w:tcBorders>
+          </w:tcPr>
+          <w:p>
+            <w:pPr>
+              <w:spacing w:line="260" w:lineRule="exact"/>
+              <w:rPr>
+                <w:sz w:val="22"/>
+                <w:szCs w:val="22"/>
+              </w:rPr>
+            </w:pPr>
           </w:p>
         </w:tc>
       </w:tr>
       <w:tr>
         <w:trPr>
-          <w:trHeight w:val="490" w:hRule="atLeast"/>
+          <w:trHeight w:val="490"/>
         </w:trPr>
         <w:tc>
           <w:tcPr>
@@ -1018,19 +1001,12 @@
           </w:tcPr>
           <w:p>
             <w:pPr>
-              <w:pStyle w:val="Normal"/>
-              <w:spacing w:lineRule="exact" w:line="260"/>
-              <w:rPr>
-                <w:sz w:val="22"/>
-                <w:szCs w:val="22"/>
-              </w:rPr>
-            </w:pPr>
-            <w:r>
-              <w:rPr>
-                <w:sz w:val="22"/>
-                <w:szCs w:val="22"/>
-              </w:rPr>
-            </w:r>
+              <w:spacing w:line="260" w:lineRule="exact"/>
+              <w:rPr>
+                <w:sz w:val="22"/>
+                <w:szCs w:val="22"/>
+              </w:rPr>
+            </w:pPr>
           </w:p>
         </w:tc>
         <w:tc>
@@ -1038,31 +1014,23 @@
             <w:tcW w:w="7083" w:type="dxa"/>
             <w:tcBorders>
               <w:top w:val="single" w:sz="4" w:space="0" w:color="000000"/>
-              <w:end w:val="single" w:sz="4" w:space="0" w:color="000000"/>
-            </w:tcBorders>
-          </w:tcPr>
-          <w:p>
-            <w:pPr>
-              <w:pStyle w:val="Normal"/>
-              <w:spacing w:lineRule="exact" w:line="260"/>
-              <w:jc w:val="end"/>
-              <w:rPr>
-                <w:sz w:val="22"/>
-                <w:szCs w:val="22"/>
-              </w:rPr>
-            </w:pPr>
-            <w:r>
-              <w:rPr>
-                <w:sz w:val="22"/>
-                <w:szCs w:val="22"/>
-              </w:rPr>
-            </w:r>
-          </w:p>
-          <w:p>
-            <w:pPr>
-              <w:pStyle w:val="Normal"/>
-              <w:spacing w:lineRule="exact" w:line="260"/>
-              <w:jc w:val="end"/>
+              <w:right w:val="single" w:sz="4" w:space="0" w:color="000000"/>
+            </w:tcBorders>
+          </w:tcPr>
+          <w:p>
+            <w:pPr>
+              <w:spacing w:line="260" w:lineRule="exact"/>
+              <w:jc w:val="right"/>
+              <w:rPr>
+                <w:sz w:val="22"/>
+                <w:szCs w:val="22"/>
+              </w:rPr>
+            </w:pPr>
+          </w:p>
+          <w:p>
+            <w:pPr>
+              <w:spacing w:line="260" w:lineRule="exact"/>
+              <w:jc w:val="right"/>
               <w:rPr>
                 <w:b/>
                 <w:bCs/>
@@ -1085,25 +1053,25 @@
             <w:tcW w:w="1174" w:type="dxa"/>
             <w:tcBorders>
               <w:top w:val="single" w:sz="4" w:space="0" w:color="000000"/>
-              <w:start w:val="single" w:sz="4" w:space="0" w:color="000000"/>
+              <w:left w:val="single" w:sz="4" w:space="0" w:color="000000"/>
               <w:bottom w:val="single" w:sz="4" w:space="0" w:color="000000"/>
-              <w:end w:val="single" w:sz="4" w:space="0" w:color="000000"/>
-            </w:tcBorders>
-          </w:tcPr>
-          <w:p>
-            <w:pPr>
-              <w:pStyle w:val="Normal"/>
-              <w:spacing w:lineRule="exact" w:line="260"/>
-              <w:rPr>
-                <w:sz w:val="22"/>
-                <w:szCs w:val="22"/>
-              </w:rPr>
-            </w:pPr>
-            <w:r>
-              <w:rPr>
-                <w:sz w:val="22"/>
-                <w:szCs w:val="22"/>
-              </w:rPr>
+              <w:right w:val="single" w:sz="4" w:space="0" w:color="000000"/>
+            </w:tcBorders>
+          </w:tcPr>
+          <w:p>
+            <w:pPr>
+              <w:spacing w:line="260" w:lineRule="exact"/>
+              <w:rPr>
+                <w:sz w:val="22"/>
+                <w:szCs w:val="22"/>
+              </w:rPr>
+            </w:pPr>
+            <w:r>
+              <w:rPr>
+                <w:sz w:val="22"/>
+                <w:szCs w:val="22"/>
+              </w:rPr>
+              <w:t>36</w:t>
             </w:r>
           </w:p>
         </w:tc>
@@ -1111,18 +1079,16 @@
     </w:tbl>
     <w:tbl>
       <w:tblPr>
-        <w:tblpPr w:vertAnchor="page" w:horzAnchor="margin" w:leftFromText="141" w:rightFromText="141" w:tblpX="0" w:tblpY="691"/>
+        <w:tblpPr w:leftFromText="141" w:rightFromText="141" w:vertAnchor="page" w:horzAnchor="margin" w:tblpY="691"/>
         <w:tblW w:w="9555" w:type="dxa"/>
-        <w:jc w:val="start"/>
-        <w:tblInd w:w="-5" w:type="dxa"/>
         <w:tblLayout w:type="fixed"/>
         <w:tblCellMar>
           <w:top w:w="57" w:type="dxa"/>
-          <w:start w:w="57" w:type="dxa"/>
+          <w:left w:w="57" w:type="dxa"/>
           <w:bottom w:w="57" w:type="dxa"/>
-          <w:end w:w="57" w:type="dxa"/>
+          <w:right w:w="57" w:type="dxa"/>
         </w:tblCellMar>
-        <w:tblLook w:val="01e0" w:noHBand="0" w:noVBand="0" w:firstColumn="1" w:lastRow="1" w:lastColumn="1" w:firstRow="1"/>
+        <w:tblLook w:val="01E0" w:firstRow="1" w:lastRow="1" w:firstColumn="1" w:lastColumn="1" w:noHBand="0" w:noVBand="0"/>
       </w:tblPr>
       <w:tblGrid>
         <w:gridCol w:w="3245"/>
@@ -1132,21 +1098,19 @@
         <w:gridCol w:w="2556"/>
       </w:tblGrid>
       <w:tr>
-        <w:trPr/>
         <w:tc>
           <w:tcPr>
             <w:tcW w:w="3245" w:type="dxa"/>
             <w:tcBorders>
               <w:top w:val="single" w:sz="4" w:space="0" w:color="808080"/>
-              <w:start w:val="single" w:sz="4" w:space="0" w:color="808080"/>
+              <w:left w:val="single" w:sz="4" w:space="0" w:color="808080"/>
               <w:bottom w:val="single" w:sz="4" w:space="0" w:color="808080"/>
-              <w:end w:val="single" w:sz="4" w:space="0" w:color="808080"/>
+              <w:right w:val="single" w:sz="4" w:space="0" w:color="808080"/>
             </w:tcBorders>
             <w:vAlign w:val="center"/>
           </w:tcPr>
           <w:p>
             <w:pPr>
-              <w:pStyle w:val="Normal"/>
               <w:rPr>
                 <w:rFonts w:cs="Arial"/>
                 <w:sz w:val="22"/>
@@ -1169,15 +1133,14 @@
             <w:gridSpan w:val="4"/>
             <w:tcBorders>
               <w:top w:val="single" w:sz="4" w:space="0" w:color="808080"/>
-              <w:start w:val="single" w:sz="4" w:space="0" w:color="808080"/>
+              <w:left w:val="single" w:sz="4" w:space="0" w:color="808080"/>
               <w:bottom w:val="single" w:sz="4" w:space="0" w:color="808080"/>
-              <w:end w:val="single" w:sz="4" w:space="0" w:color="808080"/>
+              <w:right w:val="single" w:sz="4" w:space="0" w:color="808080"/>
             </w:tcBorders>
             <w:vAlign w:val="center"/>
           </w:tcPr>
           <w:p>
             <w:pPr>
-              <w:pStyle w:val="Normal"/>
               <w:rPr>
                 <w:rFonts w:cs="Arial"/>
                 <w:sz w:val="20"/>
@@ -1194,21 +1157,19 @@
         </w:tc>
       </w:tr>
       <w:tr>
-        <w:trPr/>
         <w:tc>
           <w:tcPr>
             <w:tcW w:w="3245" w:type="dxa"/>
             <w:tcBorders>
               <w:top w:val="single" w:sz="4" w:space="0" w:color="808080"/>
-              <w:start w:val="single" w:sz="4" w:space="0" w:color="808080"/>
+              <w:left w:val="single" w:sz="4" w:space="0" w:color="808080"/>
               <w:bottom w:val="single" w:sz="4" w:space="0" w:color="808080"/>
-              <w:end w:val="single" w:sz="4" w:space="0" w:color="808080"/>
+              <w:right w:val="single" w:sz="4" w:space="0" w:color="808080"/>
             </w:tcBorders>
             <w:vAlign w:val="center"/>
           </w:tcPr>
           <w:p>
             <w:pPr>
-              <w:pStyle w:val="Normal"/>
               <w:rPr>
                 <w:rFonts w:cs="Arial"/>
                 <w:szCs w:val="22"/>
@@ -1230,15 +1191,14 @@
             <w:gridSpan w:val="4"/>
             <w:tcBorders>
               <w:top w:val="single" w:sz="4" w:space="0" w:color="808080"/>
-              <w:start w:val="single" w:sz="4" w:space="0" w:color="808080"/>
+              <w:left w:val="single" w:sz="4" w:space="0" w:color="808080"/>
               <w:bottom w:val="single" w:sz="4" w:space="0" w:color="808080"/>
-              <w:end w:val="single" w:sz="4" w:space="0" w:color="808080"/>
+              <w:right w:val="single" w:sz="4" w:space="0" w:color="808080"/>
             </w:tcBorders>
             <w:vAlign w:val="center"/>
           </w:tcPr>
           <w:p>
             <w:pPr>
-              <w:pStyle w:val="Normal"/>
               <w:rPr>
                 <w:rFonts w:cs="Arial"/>
                 <w:sz w:val="20"/>
@@ -1255,21 +1215,19 @@
         </w:tc>
       </w:tr>
       <w:tr>
-        <w:trPr/>
         <w:tc>
           <w:tcPr>
             <w:tcW w:w="3245" w:type="dxa"/>
             <w:tcBorders>
               <w:top w:val="single" w:sz="4" w:space="0" w:color="808080"/>
-              <w:start w:val="single" w:sz="4" w:space="0" w:color="808080"/>
+              <w:left w:val="single" w:sz="4" w:space="0" w:color="808080"/>
               <w:bottom w:val="single" w:sz="4" w:space="0" w:color="808080"/>
-              <w:end w:val="single" w:sz="4" w:space="0" w:color="808080"/>
+              <w:right w:val="single" w:sz="4" w:space="0" w:color="808080"/>
             </w:tcBorders>
             <w:vAlign w:val="center"/>
           </w:tcPr>
           <w:p>
             <w:pPr>
-              <w:pStyle w:val="Normal"/>
               <w:rPr>
                 <w:rFonts w:cs="Arial"/>
                 <w:szCs w:val="22"/>
@@ -1290,15 +1248,14 @@
             <w:tcW w:w="1203" w:type="dxa"/>
             <w:tcBorders>
               <w:top w:val="single" w:sz="4" w:space="0" w:color="808080"/>
-              <w:start w:val="single" w:sz="4" w:space="0" w:color="808080"/>
+              <w:left w:val="single" w:sz="4" w:space="0" w:color="808080"/>
               <w:bottom w:val="single" w:sz="4" w:space="0" w:color="808080"/>
-              <w:end w:val="single" w:sz="4" w:space="0" w:color="808080"/>
+              <w:right w:val="single" w:sz="4" w:space="0" w:color="808080"/>
             </w:tcBorders>
             <w:vAlign w:val="center"/>
           </w:tcPr>
           <w:p>
             <w:pPr>
-              <w:pStyle w:val="Normal"/>
               <w:rPr>
                 <w:rFonts w:cs="Arial"/>
                 <w:sz w:val="20"/>
@@ -1319,21 +1276,20 @@
             <w:gridSpan w:val="2"/>
             <w:tcBorders>
               <w:top w:val="single" w:sz="4" w:space="0" w:color="808080"/>
-              <w:start w:val="single" w:sz="4" w:space="0" w:color="808080"/>
+              <w:left w:val="single" w:sz="4" w:space="0" w:color="808080"/>
               <w:bottom w:val="single" w:sz="4" w:space="0" w:color="808080"/>
-              <w:end w:val="single" w:sz="4" w:space="0" w:color="808080"/>
+              <w:right w:val="single" w:sz="4" w:space="0" w:color="808080"/>
             </w:tcBorders>
             <w:tcMar>
               <w:top w:w="0" w:type="dxa"/>
-              <w:start w:w="108" w:type="dxa"/>
+              <w:left w:w="108" w:type="dxa"/>
               <w:bottom w:w="0" w:type="dxa"/>
-              <w:end w:w="108" w:type="dxa"/>
+              <w:right w:w="108" w:type="dxa"/>
             </w:tcMar>
             <w:vAlign w:val="center"/>
           </w:tcPr>
           <w:p>
             <w:pPr>
-              <w:pStyle w:val="Normal"/>
               <w:rPr>
                 <w:rFonts w:cs="Arial"/>
                 <w:szCs w:val="22"/>
@@ -1354,21 +1310,20 @@
             <w:tcW w:w="2556" w:type="dxa"/>
             <w:tcBorders>
               <w:top w:val="single" w:sz="4" w:space="0" w:color="808080"/>
-              <w:start w:val="single" w:sz="4" w:space="0" w:color="808080"/>
+              <w:left w:val="single" w:sz="4" w:space="0" w:color="808080"/>
               <w:bottom w:val="single" w:sz="4" w:space="0" w:color="808080"/>
-              <w:end w:val="single" w:sz="4" w:space="0" w:color="808080"/>
+              <w:right w:val="single" w:sz="4" w:space="0" w:color="808080"/>
             </w:tcBorders>
             <w:tcMar>
               <w:top w:w="0" w:type="dxa"/>
-              <w:start w:w="108" w:type="dxa"/>
+              <w:left w:w="108" w:type="dxa"/>
               <w:bottom w:w="0" w:type="dxa"/>
-              <w:end w:w="108" w:type="dxa"/>
+              <w:right w:w="108" w:type="dxa"/>
             </w:tcMar>
             <w:vAlign w:val="center"/>
           </w:tcPr>
           <w:p>
             <w:pPr>
-              <w:pStyle w:val="Normal"/>
               <w:rPr>
                 <w:rFonts w:cs="Arial"/>
                 <w:sz w:val="20"/>
@@ -1385,21 +1340,19 @@
         </w:tc>
       </w:tr>
       <w:tr>
-        <w:trPr/>
         <w:tc>
           <w:tcPr>
             <w:tcW w:w="3245" w:type="dxa"/>
             <w:tcBorders>
               <w:top w:val="single" w:sz="4" w:space="0" w:color="808080"/>
-              <w:start w:val="single" w:sz="4" w:space="0" w:color="808080"/>
+              <w:left w:val="single" w:sz="4" w:space="0" w:color="808080"/>
               <w:bottom w:val="single" w:sz="4" w:space="0" w:color="808080"/>
-              <w:end w:val="single" w:sz="4" w:space="0" w:color="808080"/>
+              <w:right w:val="single" w:sz="4" w:space="0" w:color="808080"/>
             </w:tcBorders>
             <w:vAlign w:val="center"/>
           </w:tcPr>
           <w:p>
             <w:pPr>
-              <w:pStyle w:val="Normal"/>
               <w:rPr>
                 <w:rFonts w:cs="Arial"/>
                 <w:szCs w:val="22"/>
@@ -1420,15 +1373,14 @@
             <w:tcW w:w="1203" w:type="dxa"/>
             <w:tcBorders>
               <w:top w:val="single" w:sz="4" w:space="0" w:color="808080"/>
-              <w:start w:val="single" w:sz="4" w:space="0" w:color="808080"/>
+              <w:left w:val="single" w:sz="4" w:space="0" w:color="808080"/>
               <w:bottom w:val="single" w:sz="4" w:space="0" w:color="808080"/>
-              <w:end w:val="single" w:sz="4" w:space="0" w:color="808080"/>
+              <w:right w:val="single" w:sz="4" w:space="0" w:color="808080"/>
             </w:tcBorders>
             <w:vAlign w:val="center"/>
           </w:tcPr>
           <w:p>
             <w:pPr>
-              <w:pStyle w:val="Normal"/>
               <w:rPr>
                 <w:rFonts w:cs="Arial"/>
                 <w:sz w:val="20"/>
@@ -1448,21 +1400,20 @@
             <w:tcW w:w="709" w:type="dxa"/>
             <w:tcBorders>
               <w:top w:val="single" w:sz="4" w:space="0" w:color="808080"/>
-              <w:start w:val="single" w:sz="4" w:space="0" w:color="808080"/>
+              <w:left w:val="single" w:sz="4" w:space="0" w:color="808080"/>
               <w:bottom w:val="single" w:sz="4" w:space="0" w:color="808080"/>
-              <w:end w:val="single" w:sz="4" w:space="0" w:color="808080"/>
+              <w:right w:val="single" w:sz="4" w:space="0" w:color="808080"/>
             </w:tcBorders>
             <w:tcMar>
               <w:top w:w="0" w:type="dxa"/>
-              <w:start w:w="108" w:type="dxa"/>
+              <w:left w:w="108" w:type="dxa"/>
               <w:bottom w:w="0" w:type="dxa"/>
-              <w:end w:w="108" w:type="dxa"/>
+              <w:right w:w="108" w:type="dxa"/>
             </w:tcMar>
             <w:vAlign w:val="center"/>
           </w:tcPr>
           <w:p>
             <w:pPr>
-              <w:pStyle w:val="Normal"/>
               <w:rPr>
                 <w:rFonts w:cs="Arial"/>
                 <w:szCs w:val="22"/>
@@ -1484,21 +1435,20 @@
             <w:gridSpan w:val="2"/>
             <w:tcBorders>
               <w:top w:val="single" w:sz="4" w:space="0" w:color="808080"/>
-              <w:start w:val="single" w:sz="4" w:space="0" w:color="808080"/>
+              <w:left w:val="single" w:sz="4" w:space="0" w:color="808080"/>
               <w:bottom w:val="single" w:sz="4" w:space="0" w:color="808080"/>
-              <w:end w:val="single" w:sz="4" w:space="0" w:color="808080"/>
+              <w:right w:val="single" w:sz="4" w:space="0" w:color="808080"/>
             </w:tcBorders>
             <w:tcMar>
               <w:top w:w="0" w:type="dxa"/>
-              <w:start w:w="108" w:type="dxa"/>
+              <w:left w:w="108" w:type="dxa"/>
               <w:bottom w:w="0" w:type="dxa"/>
-              <w:end w:w="108" w:type="dxa"/>
+              <w:right w:w="108" w:type="dxa"/>
             </w:tcMar>
             <w:vAlign w:val="center"/>
           </w:tcPr>
           <w:p>
             <w:pPr>
-              <w:pStyle w:val="Normal"/>
               <w:rPr>
                 <w:rFonts w:cs="Arial"/>
                 <w:sz w:val="20"/>
@@ -1517,72 +1467,43 @@
     </w:tbl>
     <w:p>
       <w:pPr>
-        <w:pStyle w:val="Normal"/>
-        <w:spacing w:lineRule="exact" w:line="260"/>
+        <w:spacing w:line="260" w:lineRule="exact"/>
         <w:rPr>
           <w:sz w:val="18"/>
           <w:szCs w:val="18"/>
         </w:rPr>
       </w:pPr>
-      <w:r>
-        <w:rPr>
-          <w:sz w:val="18"/>
-          <w:szCs w:val="18"/>
-        </w:rPr>
-      </w:r>
     </w:p>
     <w:p>
       <w:pPr>
-        <w:pStyle w:val="Normal"/>
-        <w:spacing w:lineRule="exact" w:line="260"/>
+        <w:spacing w:line="260" w:lineRule="exact"/>
         <w:rPr>
           <w:sz w:val="18"/>
           <w:szCs w:val="18"/>
         </w:rPr>
       </w:pPr>
-      <w:r>
-        <w:rPr>
-          <w:sz w:val="18"/>
-          <w:szCs w:val="18"/>
-        </w:rPr>
-      </w:r>
     </w:p>
     <w:p>
       <w:pPr>
-        <w:pStyle w:val="Normal"/>
-        <w:spacing w:lineRule="exact" w:line="260"/>
+        <w:spacing w:line="260" w:lineRule="exact"/>
         <w:rPr>
           <w:sz w:val="18"/>
           <w:szCs w:val="18"/>
         </w:rPr>
       </w:pPr>
-      <w:r>
-        <w:rPr>
-          <w:sz w:val="18"/>
-          <w:szCs w:val="18"/>
-        </w:rPr>
-      </w:r>
     </w:p>
     <w:p>
       <w:pPr>
-        <w:pStyle w:val="Normal"/>
-        <w:spacing w:lineRule="exact" w:line="260"/>
+        <w:spacing w:line="260" w:lineRule="exact"/>
         <w:rPr>
           <w:sz w:val="18"/>
           <w:szCs w:val="18"/>
         </w:rPr>
       </w:pPr>
-      <w:r>
-        <w:rPr>
-          <w:sz w:val="18"/>
-          <w:szCs w:val="18"/>
-        </w:rPr>
-      </w:r>
     </w:p>
     <w:p>
       <w:pPr>
-        <w:pStyle w:val="Normal"/>
-        <w:spacing w:lineRule="exact" w:line="260"/>
+        <w:spacing w:line="260" w:lineRule="exact"/>
         <w:rPr>
           <w:sz w:val="18"/>
           <w:szCs w:val="18"/>
@@ -1598,8 +1519,16 @@
     </w:p>
     <w:p>
       <w:pPr>
-        <w:pStyle w:val="Normal"/>
-        <w:spacing w:lineRule="exact" w:line="260"/>
+        <w:spacing w:line="260" w:lineRule="exact"/>
+        <w:rPr>
+          <w:sz w:val="18"/>
+          <w:szCs w:val="18"/>
+        </w:rPr>
+      </w:pPr>
+    </w:p>
+    <w:p>
+      <w:pPr>
+        <w:spacing w:line="260" w:lineRule="exact"/>
         <w:rPr>
           <w:sz w:val="18"/>
           <w:szCs w:val="18"/>
@@ -1610,46 +1539,142 @@
           <w:sz w:val="18"/>
           <w:szCs w:val="18"/>
         </w:rPr>
+        <w:fldChar w:fldCharType="begin"/>
       </w:r>
-    </w:p>
-    <w:p>
-      <w:pPr>
-        <w:pStyle w:val="Normal"/>
-        <w:spacing w:lineRule="exact" w:line="260"/>
-        <w:rPr>
-          <w:sz w:val="18"/>
-          <w:szCs w:val="18"/>
-        </w:rPr>
-      </w:pPr>
       <w:r>
         <w:rPr>
           <w:sz w:val="18"/>
           <w:szCs w:val="18"/>
         </w:rPr>
-        <w:t>TT.MM.JJJJ,</w:t>
+        <w:instrText xml:space="preserve"> DATE \@ "dd.MM.yyyy" </w:instrText>
+      </w:r>
+      <w:r>
+        <w:rPr>
+          <w:sz w:val="18"/>
+          <w:szCs w:val="18"/>
+        </w:rPr>
+        <w:fldChar w:fldCharType="separate"/>
+      </w:r>
+      <w:r>
+        <w:rPr>
+          <w:noProof/>
+          <w:sz w:val="18"/>
+          <w:szCs w:val="18"/>
+        </w:rPr>
+        <w:t>01.04.2026</w:t>
+      </w:r>
+      <w:r>
+        <w:rPr>
+          <w:sz w:val="18"/>
+          <w:szCs w:val="18"/>
+        </w:rPr>
+        <w:fldChar w:fldCharType="end"/>
+      </w:r>
+      <w:r>
+        <w:rPr>
+          <w:sz w:val="18"/>
+          <w:szCs w:val="18"/>
+        </w:rPr>
+        <w:t>,</w:t>
+      </w:r>
+      <w:r>
+        <w:rPr>
+          <w:sz w:val="18"/>
+          <w:szCs w:val="18"/>
+        </w:rPr>
         <w:tab/>
+      </w:r>
+      <w:r>
+        <w:rPr>
+          <w:sz w:val="18"/>
+          <w:szCs w:val="18"/>
+        </w:rPr>
         <w:tab/>
+      </w:r>
+      <w:r>
+        <w:rPr>
+          <w:sz w:val="18"/>
+          <w:szCs w:val="18"/>
+        </w:rPr>
         <w:tab/>
+      </w:r>
+      <w:r>
+        <w:rPr>
+          <w:sz w:val="18"/>
+          <w:szCs w:val="18"/>
+        </w:rPr>
         <w:tab/>
+      </w:r>
+      <w:r>
+        <w:rPr>
+          <w:sz w:val="18"/>
+          <w:szCs w:val="18"/>
+        </w:rPr>
         <w:tab/>
+      </w:r>
+      <w:r>
+        <w:rPr>
+          <w:sz w:val="18"/>
+          <w:szCs w:val="18"/>
+        </w:rPr>
         <w:tab/>
+      </w:r>
+      <w:r>
+        <w:rPr>
+          <w:sz w:val="18"/>
+          <w:szCs w:val="18"/>
+        </w:rPr>
         <w:tab/>
-        <w:t>TT.MM.JJJJ,</w:t>
+      </w:r>
+      <w:r>
+        <w:rPr>
+          <w:sz w:val="18"/>
+          <w:szCs w:val="18"/>
+        </w:rPr>
+        <w:fldChar w:fldCharType="begin"/>
+      </w:r>
+      <w:r>
+        <w:rPr>
+          <w:sz w:val="18"/>
+          <w:szCs w:val="18"/>
+        </w:rPr>
+        <w:instrText xml:space="preserve"> DATE \@ "dd.MM.yyyy" </w:instrText>
+      </w:r>
+      <w:r>
+        <w:rPr>
+          <w:sz w:val="18"/>
+          <w:szCs w:val="18"/>
+        </w:rPr>
+        <w:fldChar w:fldCharType="separate"/>
+      </w:r>
+      <w:r>
+        <w:rPr>
+          <w:noProof/>
+          <w:sz w:val="18"/>
+          <w:szCs w:val="18"/>
+        </w:rPr>
+        <w:t>01.04.2026</w:t>
+      </w:r>
+      <w:r>
+        <w:rPr>
+          <w:sz w:val="18"/>
+          <w:szCs w:val="18"/>
+        </w:rPr>
+        <w:fldChar w:fldCharType="end"/>
+      </w:r>
+      <w:r>
+        <w:rPr>
+          <w:sz w:val="18"/>
+          <w:szCs w:val="18"/>
+        </w:rPr>
+        <w:t>,</w:t>
       </w:r>
     </w:p>
     <w:tbl>
       <w:tblPr>
         <w:tblW w:w="9639" w:type="dxa"/>
-        <w:jc w:val="start"/>
-        <w:tblInd w:w="0" w:type="dxa"/>
         <w:tblLayout w:type="fixed"/>
-        <w:tblCellMar>
-          <w:top w:w="0" w:type="dxa"/>
-          <w:start w:w="108" w:type="dxa"/>
-          <w:bottom w:w="0" w:type="dxa"/>
-          <w:end w:w="108" w:type="dxa"/>
-        </w:tblCellMar>
-        <w:tblLook w:val="01e0" w:noHBand="0" w:noVBand="0" w:firstColumn="1" w:lastRow="1" w:lastColumn="1" w:firstRow="1"/>
+        <w:tblLook w:val="01E0" w:firstRow="1" w:lastRow="1" w:firstColumn="1" w:lastColumn="1" w:noHBand="0" w:noVBand="0"/>
       </w:tblPr>
       <w:tblGrid>
         <w:gridCol w:w="3968"/>
@@ -1657,7 +1682,6 @@
         <w:gridCol w:w="3975"/>
       </w:tblGrid>
       <w:tr>
-        <w:trPr/>
         <w:tc>
           <w:tcPr>
             <w:tcW w:w="3968" w:type="dxa"/>
@@ -1667,8 +1691,7 @@
           </w:tcPr>
           <w:p>
             <w:pPr>
-              <w:pStyle w:val="Normal"/>
-              <w:spacing w:lineRule="exact" w:line="260"/>
+              <w:spacing w:line="260" w:lineRule="exact"/>
               <w:rPr>
                 <w:sz w:val="22"/>
                 <w:szCs w:val="22"/>
@@ -1686,23 +1709,15 @@
         <w:tc>
           <w:tcPr>
             <w:tcW w:w="1696" w:type="dxa"/>
-            <w:tcBorders/>
-          </w:tcPr>
-          <w:p>
-            <w:pPr>
-              <w:pStyle w:val="Normal"/>
-              <w:spacing w:lineRule="exact" w:line="260"/>
-              <w:rPr>
-                <w:sz w:val="22"/>
-                <w:szCs w:val="22"/>
-              </w:rPr>
-            </w:pPr>
-            <w:r>
-              <w:rPr>
-                <w:sz w:val="22"/>
-                <w:szCs w:val="22"/>
-              </w:rPr>
-            </w:r>
+          </w:tcPr>
+          <w:p>
+            <w:pPr>
+              <w:spacing w:line="260" w:lineRule="exact"/>
+              <w:rPr>
+                <w:sz w:val="22"/>
+                <w:szCs w:val="22"/>
+              </w:rPr>
+            </w:pPr>
           </w:p>
         </w:tc>
         <w:tc>
@@ -1714,8 +1729,7 @@
           </w:tcPr>
           <w:p>
             <w:pPr>
-              <w:pStyle w:val="Normal"/>
-              <w:spacing w:lineRule="exact" w:line="260"/>
+              <w:spacing w:line="260" w:lineRule="exact"/>
               <w:rPr>
                 <w:sz w:val="22"/>
                 <w:szCs w:val="22"/>
@@ -1734,46 +1748,347 @@
     </w:tbl>
     <w:p>
       <w:pPr>
-        <w:pStyle w:val="Normal"/>
-        <w:spacing w:lineRule="exact" w:line="260"/>
+        <w:spacing w:line="260" w:lineRule="exact"/>
         <w:rPr>
           <w:sz w:val="22"/>
           <w:szCs w:val="22"/>
         </w:rPr>
       </w:pPr>
-      <w:r>
-        <w:rPr>
-          <w:sz w:val="22"/>
-          <w:szCs w:val="22"/>
-        </w:rPr>
-      </w:r>
     </w:p>
     <w:sectPr>
-      <w:type w:val="nextPage"/>
+      <w:footerReference w:type="even" r:id="rId8"/>
+      <w:footerReference w:type="default" r:id="rId9"/>
+      <w:footerReference w:type="first" r:id="rId10"/>
       <w:pgSz w:w="11906" w:h="16838"/>
-      <w:pgMar w:left="1080" w:right="1080" w:gutter="0" w:header="0" w:top="1440" w:footer="0" w:bottom="1440"/>
-      <w:pgNumType w:fmt="decimal"/>
-      <w:formProt w:val="false"/>
-      <w:textDirection w:val="lrTb"/>
-      <w:docGrid w:type="default" w:linePitch="100" w:charSpace="0"/>
+      <w:pgMar w:top="1440" w:right="1080" w:bottom="1440" w:left="1080" w:header="0" w:footer="0" w:gutter="0"/>
+      <w:cols w:space="720"/>
+      <w:formProt w:val="0"/>
+      <w:docGrid w:linePitch="100"/>
     </w:sectPr>
   </w:body>
 </w:document>
 </file>
 
+<file path=word/endnotes.xml><?xml version="1.0" encoding="utf-8"?>
+<w:endnotes xmlns:wpc="http://schemas.microsoft.com/office/word/2010/wordprocessingCanvas" xmlns:cx="http://schemas.microsoft.com/office/drawing/2014/chartex" xmlns:cx1="http://schemas.microsoft.com/office/drawing/2015/9/8/chartex" xmlns:cx2="http://schemas.microsoft.com/office/drawing/2015/10/21/chartex" xmlns:cx3="http://schemas.microsoft.com/office/drawing/2016/5/9/chartex" xmlns:cx4="http://schemas.microsoft.com/office/drawing/2016/5/10/chartex" xmlns:cx5="http://schemas.microsoft.com/office/drawing/2016/5/11/chartex" xmlns:cx6="http://schemas.microsoft.com/office/drawing/2016/5/12/chartex" xmlns:cx7="http://schemas.microsoft.com/office/drawing/2016/5/13/chartex" xmlns:cx8="http://schemas.microsoft.com/office/drawing/2016/5/14/chartex" xmlns:mc="http://schemas.openxmlformats.org/markup-compatibility/2006" xmlns:aink="http://schemas.microsoft.com/office/drawing/2016/ink" xmlns:am3d="http://schemas.microsoft.com/office/drawing/2017/model3d" xmlns:o="urn:schemas-microsoft-com:office:office" xmlns:oel="http://schemas.microsoft.com/office/2019/extlst" xmlns:r="http://schemas.openxmlformats.org/officeDocument/2006/relationships" xmlns:m="http://schemas.openxmlformats.org/officeDocument/2006/math" xmlns:v="urn:schemas-microsoft-com:vml" xmlns:wp14="http://schemas.microsoft.com/office/word/2010/wordprocessingDrawing" xmlns:wp="http://schemas.openxmlformats.org/drawingml/2006/wordprocessingDrawing" xmlns:w10="urn:schemas-microsoft-com:office:word" xmlns:w="http://schemas.openxmlformats.org/wordprocessingml/2006/main" xmlns:w14="http://schemas.microsoft.com/office/word/2010/wordml" xmlns:w15="http://schemas.microsoft.com/office/word/2012/wordml" xmlns:w16cex="http://schemas.microsoft.com/office/word/2018/wordml/cex" xmlns:w16cid="http://schemas.microsoft.com/office/word/2016/wordml/cid" xmlns:w16="http://schemas.microsoft.com/office/word/2018/wordml" xmlns:w16du="http://schemas.microsoft.com/office/word/2023/wordml/word16du" xmlns:w16sdtdh="http://schemas.microsoft.com/office/word/2020/wordml/sdtdatahash" xmlns:w16sdtfl="http://schemas.microsoft.com/office/word/2024/wordml/sdtformatlock" xmlns:w16se="http://schemas.microsoft.com/office/word/2015/wordml/symex" xmlns:wpg="http://schemas.microsoft.com/office/word/2010/wordprocessingGroup" xmlns:wpi="http://schemas.microsoft.com/office/word/2010/wordprocessingInk" xmlns:wne="http://schemas.microsoft.com/office/word/2006/wordml" xmlns:wps="http://schemas.microsoft.com/office/word/2010/wordprocessingShape" mc:Ignorable="w14 w15 w16se w16cid w16 w16cex w16sdtdh w16sdtfl w16du wp14">
+  <w:endnote w:type="separator" w:id="-1">
+    <w:p>
+      <w:r>
+        <w:separator/>
+      </w:r>
+    </w:p>
+  </w:endnote>
+  <w:endnote w:type="continuationSeparator" w:id="0">
+    <w:p>
+      <w:r>
+        <w:continuationSeparator/>
+      </w:r>
+    </w:p>
+  </w:endnote>
+</w:endnotes>
+</file>
+
+<file path=word/footer1.xml><?xml version="1.0" encoding="utf-8"?>
+<w:ftr xmlns:wpc="http://schemas.microsoft.com/office/word/2010/wordprocessingCanvas" xmlns:cx="http://schemas.microsoft.com/office/drawing/2014/chartex" xmlns:cx1="http://schemas.microsoft.com/office/drawing/2015/9/8/chartex" xmlns:cx2="http://schemas.microsoft.com/office/drawing/2015/10/21/chartex" xmlns:cx3="http://schemas.microsoft.com/office/drawing/2016/5/9/chartex" xmlns:cx4="http://schemas.microsoft.com/office/drawing/2016/5/10/chartex" xmlns:cx5="http://schemas.microsoft.com/office/drawing/2016/5/11/chartex" xmlns:cx6="http://schemas.microsoft.com/office/drawing/2016/5/12/chartex" xmlns:cx7="http://schemas.microsoft.com/office/drawing/2016/5/13/chartex" xmlns:cx8="http://schemas.microsoft.com/office/drawing/2016/5/14/chartex" xmlns:mc="http://schemas.openxmlformats.org/markup-compatibility/2006" xmlns:aink="http://schemas.microsoft.com/office/drawing/2016/ink" xmlns:am3d="http://schemas.microsoft.com/office/drawing/2017/model3d" xmlns:o="urn:schemas-microsoft-com:office:office" xmlns:oel="http://schemas.microsoft.com/office/2019/extlst" xmlns:r="http://schemas.openxmlformats.org/officeDocument/2006/relationships" xmlns:m="http://schemas.openxmlformats.org/officeDocument/2006/math" xmlns:v="urn:schemas-microsoft-com:vml" xmlns:wp14="http://schemas.microsoft.com/office/word/2010/wordprocessingDrawing" xmlns:wp="http://schemas.openxmlformats.org/drawingml/2006/wordprocessingDrawing" xmlns:w10="urn:schemas-microsoft-com:office:word" xmlns:w="http://schemas.openxmlformats.org/wordprocessingml/2006/main" xmlns:w14="http://schemas.microsoft.com/office/word/2010/wordml" xmlns:w15="http://schemas.microsoft.com/office/word/2012/wordml" xmlns:w16cex="http://schemas.microsoft.com/office/word/2018/wordml/cex" xmlns:w16cid="http://schemas.microsoft.com/office/word/2016/wordml/cid" xmlns:w16="http://schemas.microsoft.com/office/word/2018/wordml" xmlns:w16du="http://schemas.microsoft.com/office/word/2023/wordml/word16du" xmlns:w16sdtdh="http://schemas.microsoft.com/office/word/2020/wordml/sdtdatahash" xmlns:w16sdtfl="http://schemas.microsoft.com/office/word/2024/wordml/sdtformatlock" xmlns:w16se="http://schemas.microsoft.com/office/word/2015/wordml/symex" xmlns:wpg="http://schemas.microsoft.com/office/word/2010/wordprocessingGroup" xmlns:wpi="http://schemas.microsoft.com/office/word/2010/wordprocessingInk" xmlns:wne="http://schemas.microsoft.com/office/word/2006/wordml" xmlns:wps="http://schemas.microsoft.com/office/word/2010/wordprocessingShape" mc:Ignorable="w14 w15 w16se w16cid w16 w16cex w16sdtdh w16sdtfl w16du wp14">
+  <w:p>
+    <w:pPr>
+      <w:pStyle w:val="Fuzeile"/>
+    </w:pPr>
+    <w:r>
+      <w:rPr>
+        <w:noProof/>
+      </w:rPr>
+      <mc:AlternateContent>
+        <mc:Choice Requires="wps">
+          <w:drawing>
+            <wp:anchor distT="0" distB="0" distL="0" distR="0" simplePos="0" relativeHeight="251659264" behindDoc="0" locked="0" layoutInCell="1" allowOverlap="1" wp14:anchorId="00D56735" wp14:editId="6D8F9D57">
+              <wp:simplePos x="635" y="635"/>
+              <wp:positionH relativeFrom="page">
+                <wp:align>right</wp:align>
+              </wp:positionH>
+              <wp:positionV relativeFrom="page">
+                <wp:align>bottom</wp:align>
+              </wp:positionV>
+              <wp:extent cx="478790" cy="299085"/>
+              <wp:effectExtent l="0" t="0" r="0" b="0"/>
+              <wp:wrapNone/>
+              <wp:docPr id="42945936" name="Textfeld 2" descr="intern">
+                <a:extLst xmlns:a="http://schemas.openxmlformats.org/drawingml/2006/main">
+                  <a:ext uri="{5AE41FA2-C0FF-4470-9BD4-5FADCA87CBE2}">
+                    <aclsh:classification xmlns:aclsh="http://schemas.microsoft.com/office/drawing/2020/classificationShape" classificationOutcomeType="ftr"/>
+                  </a:ext>
+                </a:extLst>
+              </wp:docPr>
+              <wp:cNvGraphicFramePr/>
+              <a:graphic xmlns:a="http://schemas.openxmlformats.org/drawingml/2006/main">
+                <a:graphicData uri="http://schemas.microsoft.com/office/word/2010/wordprocessingShape">
+                  <wps:wsp>
+                    <wps:cNvSpPr txBox="1"/>
+                    <wps:spPr>
+                      <a:xfrm>
+                        <a:off x="0" y="0"/>
+                        <a:ext cx="478790" cy="299085"/>
+                      </a:xfrm>
+                      <a:prstGeom prst="rect">
+                        <a:avLst/>
+                      </a:prstGeom>
+                      <a:noFill/>
+                      <a:ln>
+                        <a:noFill/>
+                      </a:ln>
+                    </wps:spPr>
+                    <wps:txbx>
+                      <w:txbxContent>
+                        <w:p>
+                          <w:pPr>
+                            <w:rPr>
+                              <w:rFonts w:ascii="Aptos" w:eastAsia="Aptos" w:hAnsi="Aptos" w:cs="Aptos"/>
+                              <w:noProof/>
+                              <w:color w:val="000000"/>
+                              <w:sz w:val="14"/>
+                              <w:szCs w:val="14"/>
+                            </w:rPr>
+                          </w:pPr>
+                          <w:r>
+                            <w:rPr>
+                              <w:rFonts w:ascii="Aptos" w:eastAsia="Aptos" w:hAnsi="Aptos" w:cs="Aptos"/>
+                              <w:noProof/>
+                              <w:color w:val="000000"/>
+                              <w:sz w:val="14"/>
+                              <w:szCs w:val="14"/>
+                            </w:rPr>
+                            <w:t>intern</w:t>
+                          </w:r>
+                        </w:p>
+                      </w:txbxContent>
+                    </wps:txbx>
+                    <wps:bodyPr rot="0" spcFirstLastPara="0" vertOverflow="overflow" horzOverflow="overflow" vert="horz" wrap="none" lIns="0" tIns="0" rIns="254000" bIns="190500" numCol="1" spcCol="0" rtlCol="0" fromWordArt="0" anchor="b" anchorCtr="0" forceAA="0" compatLnSpc="1">
+                      <a:prstTxWarp prst="textNoShape">
+                        <a:avLst/>
+                      </a:prstTxWarp>
+                      <a:spAutoFit/>
+                    </wps:bodyPr>
+                  </wps:wsp>
+                </a:graphicData>
+              </a:graphic>
+            </wp:anchor>
+          </w:drawing>
+        </mc:Choice>
+        <mc:Fallback>
+          <w:pict>
+            <v:shapetype w14:anchorId="00D56735" id="_x0000_t202" coordsize="21600,21600" o:spt="202" path="m,l,21600r21600,l21600,xe">
+              <v:stroke joinstyle="miter"/>
+              <v:path gradientshapeok="t" o:connecttype="rect"/>
+            </v:shapetype>
+            <v:shape id="Textfeld 2" o:spid="_x0000_s1026" type="#_x0000_t202" alt="intern" style="position:absolute;margin-left:-13.5pt;margin-top:0;width:37.7pt;height:23.55pt;z-index:251659264;visibility:visible;mso-wrap-style:none;mso-wrap-distance-left:0;mso-wrap-distance-top:0;mso-wrap-distance-right:0;mso-wrap-distance-bottom:0;mso-position-horizontal:right;mso-position-horizontal-relative:page;mso-position-vertical:bottom;mso-position-vertical-relative:page;v-text-anchor:bottom" o:gfxdata="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" filled="f" stroked="f">
+              <v:textbox style="mso-fit-shape-to-text:t" inset="0,0,20pt,15pt">
+                <w:txbxContent>
+                  <w:p>
+                    <w:pPr>
+                      <w:rPr>
+                        <w:rFonts w:ascii="Aptos" w:eastAsia="Aptos" w:hAnsi="Aptos" w:cs="Aptos"/>
+                        <w:noProof/>
+                        <w:color w:val="000000"/>
+                        <w:sz w:val="14"/>
+                        <w:szCs w:val="14"/>
+                      </w:rPr>
+                    </w:pPr>
+                    <w:r>
+                      <w:rPr>
+                        <w:rFonts w:ascii="Aptos" w:eastAsia="Aptos" w:hAnsi="Aptos" w:cs="Aptos"/>
+                        <w:noProof/>
+                        <w:color w:val="000000"/>
+                        <w:sz w:val="14"/>
+                        <w:szCs w:val="14"/>
+                      </w:rPr>
+                      <w:t>intern</w:t>
+                    </w:r>
+                  </w:p>
+                </w:txbxContent>
+              </v:textbox>
+              <w10:wrap anchorx="page" anchory="page"/>
+            </v:shape>
+          </w:pict>
+        </mc:Fallback>
+      </mc:AlternateContent>
+    </w:r>
+  </w:p>
+</w:ftr>
+</file>
+
+<file path=word/footer2.xml><?xml version="1.0" encoding="utf-8"?>
+<w:ftr xmlns:wpc="http://schemas.microsoft.com/office/word/2010/wordprocessingCanvas" xmlns:cx="http://schemas.microsoft.com/office/drawing/2014/chartex" xmlns:cx1="http://schemas.microsoft.com/office/drawing/2015/9/8/chartex" xmlns:cx2="http://schemas.microsoft.com/office/drawing/2015/10/21/chartex" xmlns:cx3="http://schemas.microsoft.com/office/drawing/2016/5/9/chartex" xmlns:cx4="http://schemas.microsoft.com/office/drawing/2016/5/10/chartex" xmlns:cx5="http://schemas.microsoft.com/office/drawing/2016/5/11/chartex" xmlns:cx6="http://schemas.microsoft.com/office/drawing/2016/5/12/chartex" xmlns:cx7="http://schemas.microsoft.com/office/drawing/2016/5/13/chartex" xmlns:cx8="http://schemas.microsoft.com/office/drawing/2016/5/14/chartex" xmlns:mc="http://schemas.openxmlformats.org/markup-compatibility/2006" xmlns:aink="http://schemas.microsoft.com/office/drawing/2016/ink" xmlns:am3d="http://schemas.microsoft.com/office/drawing/2017/model3d" xmlns:o="urn:schemas-microsoft-com:office:office" xmlns:oel="http://schemas.microsoft.com/office/2019/extlst" xmlns:r="http://schemas.openxmlformats.org/officeDocument/2006/relationships" xmlns:m="http://schemas.openxmlformats.org/officeDocument/2006/math" xmlns:v="urn:schemas-microsoft-com:vml" xmlns:wp14="http://schemas.microsoft.com/office/word/2010/wordprocessingDrawing" xmlns:wp="http://schemas.openxmlformats.org/drawingml/2006/wordprocessingDrawing" xmlns:w10="urn:schemas-microsoft-com:office:word" xmlns:w="http://schemas.openxmlformats.org/wordprocessingml/2006/main" xmlns:w14="http://schemas.microsoft.com/office/word/2010/wordml" xmlns:w15="http://schemas.microsoft.com/office/word/2012/wordml" xmlns:w16cex="http://schemas.microsoft.com/office/word/2018/wordml/cex" xmlns:w16cid="http://schemas.microsoft.com/office/word/2016/wordml/cid" xmlns:w16="http://schemas.microsoft.com/office/word/2018/wordml" xmlns:w16du="http://schemas.microsoft.com/office/word/2023/wordml/word16du" xmlns:w16sdtdh="http://schemas.microsoft.com/office/word/2020/wordml/sdtdatahash" xmlns:w16sdtfl="http://schemas.microsoft.com/office/word/2024/wordml/sdtformatlock" xmlns:w16se="http://schemas.microsoft.com/office/word/2015/wordml/symex" xmlns:wpg="http://schemas.microsoft.com/office/word/2010/wordprocessingGroup" xmlns:wpi="http://schemas.microsoft.com/office/word/2010/wordprocessingInk" xmlns:wne="http://schemas.microsoft.com/office/word/2006/wordml" xmlns:wps="http://schemas.microsoft.com/office/word/2010/wordprocessingShape" mc:Ignorable="w14 w15 w16se w16cid w16 w16cex w16sdtdh w16sdtfl w16du wp14">
+  <w:p>
+    <w:pPr>
+      <w:pStyle w:val="Fuzeile"/>
+    </w:pPr>
+  </w:p>
+</w:ftr>
+</file>
+
+<file path=word/footer3.xml><?xml version="1.0" encoding="utf-8"?>
+<w:ftr xmlns:wpc="http://schemas.microsoft.com/office/word/2010/wordprocessingCanvas" xmlns:cx="http://schemas.microsoft.com/office/drawing/2014/chartex" xmlns:cx1="http://schemas.microsoft.com/office/drawing/2015/9/8/chartex" xmlns:cx2="http://schemas.microsoft.com/office/drawing/2015/10/21/chartex" xmlns:cx3="http://schemas.microsoft.com/office/drawing/2016/5/9/chartex" xmlns:cx4="http://schemas.microsoft.com/office/drawing/2016/5/10/chartex" xmlns:cx5="http://schemas.microsoft.com/office/drawing/2016/5/11/chartex" xmlns:cx6="http://schemas.microsoft.com/office/drawing/2016/5/12/chartex" xmlns:cx7="http://schemas.microsoft.com/office/drawing/2016/5/13/chartex" xmlns:cx8="http://schemas.microsoft.com/office/drawing/2016/5/14/chartex" xmlns:mc="http://schemas.openxmlformats.org/markup-compatibility/2006" xmlns:aink="http://schemas.microsoft.com/office/drawing/2016/ink" xmlns:am3d="http://schemas.microsoft.com/office/drawing/2017/model3d" xmlns:o="urn:schemas-microsoft-com:office:office" xmlns:oel="http://schemas.microsoft.com/office/2019/extlst" xmlns:r="http://schemas.openxmlformats.org/officeDocument/2006/relationships" xmlns:m="http://schemas.openxmlformats.org/officeDocument/2006/math" xmlns:v="urn:schemas-microsoft-com:vml" xmlns:wp14="http://schemas.microsoft.com/office/word/2010/wordprocessingDrawing" xmlns:wp="http://schemas.openxmlformats.org/drawingml/2006/wordprocessingDrawing" xmlns:w10="urn:schemas-microsoft-com:office:word" xmlns:w="http://schemas.openxmlformats.org/wordprocessingml/2006/main" xmlns:w14="http://schemas.microsoft.com/office/word/2010/wordml" xmlns:w15="http://schemas.microsoft.com/office/word/2012/wordml" xmlns:w16cex="http://schemas.microsoft.com/office/word/2018/wordml/cex" xmlns:w16cid="http://schemas.microsoft.com/office/word/2016/wordml/cid" xmlns:w16="http://schemas.microsoft.com/office/word/2018/wordml" xmlns:w16du="http://schemas.microsoft.com/office/word/2023/wordml/word16du" xmlns:w16sdtdh="http://schemas.microsoft.com/office/word/2020/wordml/sdtdatahash" xmlns:w16sdtfl="http://schemas.microsoft.com/office/word/2024/wordml/sdtformatlock" xmlns:w16se="http://schemas.microsoft.com/office/word/2015/wordml/symex" xmlns:wpg="http://schemas.microsoft.com/office/word/2010/wordprocessingGroup" xmlns:wpi="http://schemas.microsoft.com/office/word/2010/wordprocessingInk" xmlns:wne="http://schemas.microsoft.com/office/word/2006/wordml" xmlns:wps="http://schemas.microsoft.com/office/word/2010/wordprocessingShape" mc:Ignorable="w14 w15 w16se w16cid w16 w16cex w16sdtdh w16sdtfl w16du wp14">
+  <w:p>
+    <w:pPr>
+      <w:pStyle w:val="Fuzeile"/>
+    </w:pPr>
+    <w:r>
+      <w:rPr>
+        <w:noProof/>
+      </w:rPr>
+      <mc:AlternateContent>
+        <mc:Choice Requires="wps">
+          <w:drawing>
+            <wp:anchor distT="0" distB="0" distL="0" distR="0" simplePos="0" relativeHeight="251658240" behindDoc="0" locked="0" layoutInCell="1" allowOverlap="1" wp14:anchorId="214CE05A" wp14:editId="709DB263">
+              <wp:simplePos x="635" y="635"/>
+              <wp:positionH relativeFrom="page">
+                <wp:align>right</wp:align>
+              </wp:positionH>
+              <wp:positionV relativeFrom="page">
+                <wp:align>bottom</wp:align>
+              </wp:positionV>
+              <wp:extent cx="478790" cy="299085"/>
+              <wp:effectExtent l="0" t="0" r="0" b="0"/>
+              <wp:wrapNone/>
+              <wp:docPr id="60005356" name="Textfeld 1" descr="intern">
+                <a:extLst xmlns:a="http://schemas.openxmlformats.org/drawingml/2006/main">
+                  <a:ext uri="{5AE41FA2-C0FF-4470-9BD4-5FADCA87CBE2}">
+                    <aclsh:classification xmlns:aclsh="http://schemas.microsoft.com/office/drawing/2020/classificationShape" classificationOutcomeType="ftr"/>
+                  </a:ext>
+                </a:extLst>
+              </wp:docPr>
+              <wp:cNvGraphicFramePr/>
+              <a:graphic xmlns:a="http://schemas.openxmlformats.org/drawingml/2006/main">
+                <a:graphicData uri="http://schemas.microsoft.com/office/word/2010/wordprocessingShape">
+                  <wps:wsp>
+                    <wps:cNvSpPr txBox="1"/>
+                    <wps:spPr>
+                      <a:xfrm>
+                        <a:off x="0" y="0"/>
+                        <a:ext cx="478790" cy="299085"/>
+                      </a:xfrm>
+                      <a:prstGeom prst="rect">
+                        <a:avLst/>
+                      </a:prstGeom>
+                      <a:noFill/>
+                      <a:ln>
+                        <a:noFill/>
+                      </a:ln>
+                    </wps:spPr>
+                    <wps:txbx>
+                      <w:txbxContent>
+                        <w:p>
+                          <w:pPr>
+                            <w:rPr>
+                              <w:rFonts w:ascii="Aptos" w:eastAsia="Aptos" w:hAnsi="Aptos" w:cs="Aptos"/>
+                              <w:noProof/>
+                              <w:color w:val="000000"/>
+                              <w:sz w:val="14"/>
+                              <w:szCs w:val="14"/>
+                            </w:rPr>
+                          </w:pPr>
+                          <w:r>
+                            <w:rPr>
+                              <w:rFonts w:ascii="Aptos" w:eastAsia="Aptos" w:hAnsi="Aptos" w:cs="Aptos"/>
+                              <w:noProof/>
+                              <w:color w:val="000000"/>
+                              <w:sz w:val="14"/>
+                              <w:szCs w:val="14"/>
+                            </w:rPr>
+                            <w:t>intern</w:t>
+                          </w:r>
+                        </w:p>
+                      </w:txbxContent>
+                    </wps:txbx>
+                    <wps:bodyPr rot="0" spcFirstLastPara="0" vertOverflow="overflow" horzOverflow="overflow" vert="horz" wrap="none" lIns="0" tIns="0" rIns="254000" bIns="190500" numCol="1" spcCol="0" rtlCol="0" fromWordArt="0" anchor="b" anchorCtr="0" forceAA="0" compatLnSpc="1">
+                      <a:prstTxWarp prst="textNoShape">
+                        <a:avLst/>
+                      </a:prstTxWarp>
+                      <a:spAutoFit/>
+                    </wps:bodyPr>
+                  </wps:wsp>
+                </a:graphicData>
+              </a:graphic>
+            </wp:anchor>
+          </w:drawing>
+        </mc:Choice>
+        <mc:Fallback>
+          <w:pict>
+            <v:shapetype w14:anchorId="214CE05A" id="_x0000_t202" coordsize="21600,21600" o:spt="202" path="m,l,21600r21600,l21600,xe">
+              <v:stroke joinstyle="miter"/>
+              <v:path gradientshapeok="t" o:connecttype="rect"/>
+            </v:shapetype>
+            <v:shape id="Textfeld 1" o:spid="_x0000_s1027" type="#_x0000_t202" alt="intern" style="position:absolute;margin-left:-13.5pt;margin-top:0;width:37.7pt;height:23.55pt;z-index:251658240;visibility:visible;mso-wrap-style:none;mso-wrap-distance-left:0;mso-wrap-distance-top:0;mso-wrap-distance-right:0;mso-wrap-distance-bottom:0;mso-position-horizontal:right;mso-position-horizontal-relative:page;mso-position-vertical:bottom;mso-position-vertical-relative:page;v-text-anchor:bottom" o:gfxdata="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" filled="f" stroked="f">
+              <v:textbox style="mso-fit-shape-to-text:t" inset="0,0,20pt,15pt">
+                <w:txbxContent>
+                  <w:p>
+                    <w:pPr>
+                      <w:rPr>
+                        <w:rFonts w:ascii="Aptos" w:eastAsia="Aptos" w:hAnsi="Aptos" w:cs="Aptos"/>
+                        <w:noProof/>
+                        <w:color w:val="000000"/>
+                        <w:sz w:val="14"/>
+                        <w:szCs w:val="14"/>
+                      </w:rPr>
+                    </w:pPr>
+                    <w:r>
+                      <w:rPr>
+                        <w:rFonts w:ascii="Aptos" w:eastAsia="Aptos" w:hAnsi="Aptos" w:cs="Aptos"/>
+                        <w:noProof/>
+                        <w:color w:val="000000"/>
+                        <w:sz w:val="14"/>
+                        <w:szCs w:val="14"/>
+                      </w:rPr>
+                      <w:t>intern</w:t>
+                    </w:r>
+                  </w:p>
+                </w:txbxContent>
+              </v:textbox>
+              <w10:wrap anchorx="page" anchory="page"/>
+            </v:shape>
+          </w:pict>
+        </mc:Fallback>
+      </mc:AlternateContent>
+    </w:r>
+  </w:p>
+</w:ftr>
+</file>
+
+<file path=word/footnotes.xml><?xml version="1.0" encoding="utf-8"?>
+<w:footnotes xmlns:wpc="http://schemas.microsoft.com/office/word/2010/wordprocessingCanvas" xmlns:cx="http://schemas.microsoft.com/office/drawing/2014/chartex" xmlns:cx1="http://schemas.microsoft.com/office/drawing/2015/9/8/chartex" xmlns:cx2="http://schemas.microsoft.com/office/drawing/2015/10/21/chartex" xmlns:cx3="http://schemas.microsoft.com/office/drawing/2016/5/9/chartex" xmlns:cx4="http://schemas.microsoft.com/office/drawing/2016/5/10/chartex" xmlns:cx5="http://schemas.microsoft.com/office/drawing/2016/5/11/chartex" xmlns:cx6="http://schemas.microsoft.com/office/drawing/2016/5/12/chartex" xmlns:cx7="http://schemas.microsoft.com/office/drawing/2016/5/13/chartex" xmlns:cx8="http://schemas.microsoft.com/office/drawing/2016/5/14/chartex" xmlns:mc="http://schemas.openxmlformats.org/markup-compatibility/2006" xmlns:aink="http://schemas.microsoft.com/office/drawing/2016/ink" xmlns:am3d="http://schemas.microsoft.com/office/drawing/2017/model3d" xmlns:o="urn:schemas-microsoft-com:office:office" xmlns:oel="http://schemas.microsoft.com/office/2019/extlst" xmlns:r="http://schemas.openxmlformats.org/officeDocument/2006/relationships" xmlns:m="http://schemas.openxmlformats.org/officeDocument/2006/math" xmlns:v="urn:schemas-microsoft-com:vml" xmlns:wp14="http://schemas.microsoft.com/office/word/2010/wordprocessingDrawing" xmlns:wp="http://schemas.openxmlformats.org/drawingml/2006/wordprocessingDrawing" xmlns:w10="urn:schemas-microsoft-com:office:word" xmlns:w="http://schemas.openxmlformats.org/wordprocessingml/2006/main" xmlns:w14="http://schemas.microsoft.com/office/word/2010/wordml" xmlns:w15="http://schemas.microsoft.com/office/word/2012/wordml" xmlns:w16cex="http://schemas.microsoft.com/office/word/2018/wordml/cex" xmlns:w16cid="http://schemas.microsoft.com/office/word/2016/wordml/cid" xmlns:w16="http://schemas.microsoft.com/office/word/2018/wordml" xmlns:w16du="http://schemas.microsoft.com/office/word/2023/wordml/word16du" xmlns:w16sdtdh="http://schemas.microsoft.com/office/word/2020/wordml/sdtdatahash" xmlns:w16sdtfl="http://schemas.microsoft.com/office/word/2024/wordml/sdtformatlock" xmlns:w16se="http://schemas.microsoft.com/office/word/2015/wordml/symex" xmlns:wpg="http://schemas.microsoft.com/office/word/2010/wordprocessingGroup" xmlns:wpi="http://schemas.microsoft.com/office/word/2010/wordprocessingInk" xmlns:wne="http://schemas.microsoft.com/office/word/2006/wordml" xmlns:wps="http://schemas.microsoft.com/office/word/2010/wordprocessingShape" mc:Ignorable="w14 w15 w16se w16cid w16 w16cex w16sdtdh w16sdtfl w16du wp14">
+  <w:footnote w:type="separator" w:id="-1">
+    <w:p>
+      <w:r>
+        <w:separator/>
+      </w:r>
+    </w:p>
+  </w:footnote>
+  <w:footnote w:type="continuationSeparator" w:id="0">
+    <w:p>
+      <w:r>
+        <w:continuationSeparator/>
+      </w:r>
+    </w:p>
+  </w:footnote>
+</w:footnotes>
+</file>
+
 <file path=word/numbering.xml><?xml version="1.0" encoding="utf-8"?>
-<w:numbering xmlns:w="http://schemas.openxmlformats.org/wordprocessingml/2006/main" xmlns:o="urn:schemas-microsoft-com:office:office" xmlns:r="http://schemas.openxmlformats.org/officeDocument/2006/relationships" xmlns:v="urn:schemas-microsoft-com:vml" xmlns:mc="http://schemas.openxmlformats.org/markup-compatibility/2006" xmlns:w14="http://schemas.microsoft.com/office/word/2010/wordml" mc:Ignorable="w14">
-  <w:abstractNum w:abstractNumId="1">
+<w:numbering xmlns:wpc="http://schemas.microsoft.com/office/word/2010/wordprocessingCanvas" xmlns:cx="http://schemas.microsoft.com/office/drawing/2014/chartex" xmlns:cx1="http://schemas.microsoft.com/office/drawing/2015/9/8/chartex" xmlns:cx2="http://schemas.microsoft.com/office/drawing/2015/10/21/chartex" xmlns:cx3="http://schemas.microsoft.com/office/drawing/2016/5/9/chartex" xmlns:cx4="http://schemas.microsoft.com/office/drawing/2016/5/10/chartex" xmlns:cx5="http://schemas.microsoft.com/office/drawing/2016/5/11/chartex" xmlns:cx6="http://schemas.microsoft.com/office/drawing/2016/5/12/chartex" xmlns:cx7="http://schemas.microsoft.com/office/drawing/2016/5/13/chartex" xmlns:cx8="http://schemas.microsoft.com/office/drawing/2016/5/14/chartex" xmlns:mc="http://schemas.openxmlformats.org/markup-compatibility/2006" xmlns:aink="http://schemas.microsoft.com/office/drawing/2016/ink" xmlns:am3d="http://schemas.microsoft.com/office/drawing/2017/model3d" xmlns:o="urn:schemas-microsoft-com:office:office" xmlns:oel="http://schemas.microsoft.com/office/2019/extlst" xmlns:r="http://schemas.openxmlformats.org/officeDocument/2006/relationships" xmlns:m="http://schemas.openxmlformats.org/officeDocument/2006/math" xmlns:v="urn:schemas-microsoft-com:vml" xmlns:wp14="http://schemas.microsoft.com/office/word/2010/wordprocessingDrawing" xmlns:wp="http://schemas.openxmlformats.org/drawingml/2006/wordprocessingDrawing" xmlns:w10="urn:schemas-microsoft-com:office:word" xmlns:w="http://schemas.openxmlformats.org/wordprocessingml/2006/main" xmlns:w14="http://schemas.microsoft.com/office/word/2010/wordml" xmlns:w15="http://schemas.microsoft.com/office/word/2012/wordml" xmlns:w16cex="http://schemas.microsoft.com/office/word/2018/wordml/cex" xmlns:w16cid="http://schemas.microsoft.com/office/word/2016/wordml/cid" xmlns:w16="http://schemas.microsoft.com/office/word/2018/wordml" xmlns:w16du="http://schemas.microsoft.com/office/word/2023/wordml/word16du" xmlns:w16sdtdh="http://schemas.microsoft.com/office/word/2020/wordml/sdtdatahash" xmlns:w16sdtfl="http://schemas.microsoft.com/office/word/2024/wordml/sdtformatlock" xmlns:w16se="http://schemas.microsoft.com/office/word/2015/wordml/symex" xmlns:wpg="http://schemas.microsoft.com/office/word/2010/wordprocessingGroup" xmlns:wpi="http://schemas.microsoft.com/office/word/2010/wordprocessingInk" xmlns:wne="http://schemas.microsoft.com/office/word/2006/wordml" xmlns:wps="http://schemas.microsoft.com/office/word/2010/wordprocessingShape" mc:Ignorable="w14 w15 w16se w16cid w16 w16cex w16sdtdh w16sdtfl w16du wp14">
+  <w:abstractNum w:abstractNumId="0" w15:restartNumberingAfterBreak="0">
+    <w:nsid w:val="057A432F"/>
+    <w:multiLevelType w:val="multilevel"/>
+    <w:tmpl w:val="4ED0EC14"/>
     <w:lvl w:ilvl="0">
       <w:start w:val="1"/>
       <w:numFmt w:val="bullet"/>
       <w:lvlText w:val=""/>
-      <w:lvlJc w:val="start"/>
+      <w:lvlJc w:val="left"/>
       <w:pPr>
         <w:tabs>
           <w:tab w:val="num" w:pos="0"/>
         </w:tabs>
-        <w:ind w:start="720" w:hanging="360"/>
+        <w:ind w:left="720" w:hanging="360"/>
       </w:pPr>
       <w:rPr>
         <w:rFonts w:ascii="Symbol" w:hAnsi="Symbol" w:cs="Symbol" w:hint="default"/>
@@ -1783,12 +2098,12 @@
       <w:start w:val="1"/>
       <w:numFmt w:val="bullet"/>
       <w:lvlText w:val="o"/>
-      <w:lvlJc w:val="start"/>
+      <w:lvlJc w:val="left"/>
       <w:pPr>
         <w:tabs>
           <w:tab w:val="num" w:pos="0"/>
         </w:tabs>
-        <w:ind w:start="1440" w:hanging="360"/>
+        <w:ind w:left="1440" w:hanging="360"/>
       </w:pPr>
       <w:rPr>
         <w:rFonts w:ascii="Courier New" w:hAnsi="Courier New" w:cs="Courier New" w:hint="default"/>
@@ -1798,12 +2113,12 @@
       <w:start w:val="1"/>
       <w:numFmt w:val="bullet"/>
       <w:lvlText w:val=""/>
-      <w:lvlJc w:val="start"/>
+      <w:lvlJc w:val="left"/>
       <w:pPr>
         <w:tabs>
           <w:tab w:val="num" w:pos="0"/>
         </w:tabs>
-        <w:ind w:start="2160" w:hanging="360"/>
+        <w:ind w:left="2160" w:hanging="360"/>
       </w:pPr>
       <w:rPr>
         <w:rFonts w:ascii="Wingdings" w:hAnsi="Wingdings" w:cs="Wingdings" w:hint="default"/>
@@ -1813,12 +2128,12 @@
       <w:start w:val="1"/>
       <w:numFmt w:val="bullet"/>
       <w:lvlText w:val=""/>
-      <w:lvlJc w:val="start"/>
+      <w:lvlJc w:val="left"/>
       <w:pPr>
         <w:tabs>
           <w:tab w:val="num" w:pos="0"/>
         </w:tabs>
-        <w:ind w:start="2880" w:hanging="360"/>
+        <w:ind w:left="2880" w:hanging="360"/>
       </w:pPr>
       <w:rPr>
         <w:rFonts w:ascii="Symbol" w:hAnsi="Symbol" w:cs="Symbol" w:hint="default"/>
@@ -1828,12 +2143,12 @@
       <w:start w:val="1"/>
       <w:numFmt w:val="bullet"/>
       <w:lvlText w:val="o"/>
-      <w:lvlJc w:val="start"/>
+      <w:lvlJc w:val="left"/>
       <w:pPr>
         <w:tabs>
           <w:tab w:val="num" w:pos="0"/>
         </w:tabs>
-        <w:ind w:start="3600" w:hanging="360"/>
+        <w:ind w:left="3600" w:hanging="360"/>
       </w:pPr>
       <w:rPr>
         <w:rFonts w:ascii="Courier New" w:hAnsi="Courier New" w:cs="Courier New" w:hint="default"/>
@@ -1843,12 +2158,12 @@
       <w:start w:val="1"/>
       <w:numFmt w:val="bullet"/>
       <w:lvlText w:val=""/>
-      <w:lvlJc w:val="start"/>
+      <w:lvlJc w:val="left"/>
       <w:pPr>
         <w:tabs>
           <w:tab w:val="num" w:pos="0"/>
         </w:tabs>
-        <w:ind w:start="4320" w:hanging="360"/>
+        <w:ind w:left="4320" w:hanging="360"/>
       </w:pPr>
       <w:rPr>
         <w:rFonts w:ascii="Wingdings" w:hAnsi="Wingdings" w:cs="Wingdings" w:hint="default"/>
@@ -1858,12 +2173,12 @@
       <w:start w:val="1"/>
       <w:numFmt w:val="bullet"/>
       <w:lvlText w:val=""/>
-      <w:lvlJc w:val="start"/>
+      <w:lvlJc w:val="left"/>
       <w:pPr>
         <w:tabs>
           <w:tab w:val="num" w:pos="0"/>
         </w:tabs>
-        <w:ind w:start="5040" w:hanging="360"/>
+        <w:ind w:left="5040" w:hanging="360"/>
       </w:pPr>
       <w:rPr>
         <w:rFonts w:ascii="Symbol" w:hAnsi="Symbol" w:cs="Symbol" w:hint="default"/>
@@ -1873,12 +2188,12 @@
       <w:start w:val="1"/>
       <w:numFmt w:val="bullet"/>
       <w:lvlText w:val="o"/>
-      <w:lvlJc w:val="start"/>
+      <w:lvlJc w:val="left"/>
       <w:pPr>
         <w:tabs>
           <w:tab w:val="num" w:pos="0"/>
         </w:tabs>
-        <w:ind w:start="5760" w:hanging="360"/>
+        <w:ind w:left="5760" w:hanging="360"/>
       </w:pPr>
       <w:rPr>
         <w:rFonts w:ascii="Courier New" w:hAnsi="Courier New" w:cs="Courier New" w:hint="default"/>
@@ -1888,30 +2203,33 @@
       <w:start w:val="1"/>
       <w:numFmt w:val="bullet"/>
       <w:lvlText w:val=""/>
-      <w:lvlJc w:val="start"/>
+      <w:lvlJc w:val="left"/>
       <w:pPr>
         <w:tabs>
           <w:tab w:val="num" w:pos="0"/>
         </w:tabs>
-        <w:ind w:start="6480" w:hanging="360"/>
+        <w:ind w:left="6480" w:hanging="360"/>
       </w:pPr>
       <w:rPr>
         <w:rFonts w:ascii="Wingdings" w:hAnsi="Wingdings" w:cs="Wingdings" w:hint="default"/>
       </w:rPr>
     </w:lvl>
   </w:abstractNum>
-  <w:abstractNum w:abstractNumId="2">
+  <w:abstractNum w:abstractNumId="1" w15:restartNumberingAfterBreak="0">
+    <w:nsid w:val="2F0C24D3"/>
+    <w:multiLevelType w:val="multilevel"/>
+    <w:tmpl w:val="C15A282E"/>
     <w:lvl w:ilvl="0">
       <w:start w:val="1"/>
       <w:numFmt w:val="none"/>
       <w:suff w:val="nothing"/>
       <w:lvlText w:val=""/>
-      <w:lvlJc w:val="start"/>
+      <w:lvlJc w:val="left"/>
       <w:pPr>
         <w:tabs>
           <w:tab w:val="num" w:pos="0"/>
         </w:tabs>
-        <w:ind w:start="0" w:hanging="0"/>
+        <w:ind w:left="0" w:firstLine="0"/>
       </w:pPr>
     </w:lvl>
     <w:lvl w:ilvl="1">
@@ -1919,12 +2237,12 @@
       <w:numFmt w:val="none"/>
       <w:suff w:val="nothing"/>
       <w:lvlText w:val=""/>
-      <w:lvlJc w:val="start"/>
+      <w:lvlJc w:val="left"/>
       <w:pPr>
         <w:tabs>
           <w:tab w:val="num" w:pos="0"/>
         </w:tabs>
-        <w:ind w:start="0" w:hanging="0"/>
+        <w:ind w:left="0" w:firstLine="0"/>
       </w:pPr>
     </w:lvl>
     <w:lvl w:ilvl="2">
@@ -1932,12 +2250,12 @@
       <w:numFmt w:val="none"/>
       <w:suff w:val="nothing"/>
       <w:lvlText w:val=""/>
-      <w:lvlJc w:val="start"/>
+      <w:lvlJc w:val="left"/>
       <w:pPr>
         <w:tabs>
           <w:tab w:val="num" w:pos="0"/>
         </w:tabs>
-        <w:ind w:start="0" w:hanging="0"/>
+        <w:ind w:left="0" w:firstLine="0"/>
       </w:pPr>
     </w:lvl>
     <w:lvl w:ilvl="3">
@@ -1945,12 +2263,12 @@
       <w:numFmt w:val="none"/>
       <w:suff w:val="nothing"/>
       <w:lvlText w:val=""/>
-      <w:lvlJc w:val="start"/>
+      <w:lvlJc w:val="left"/>
       <w:pPr>
         <w:tabs>
           <w:tab w:val="num" w:pos="0"/>
         </w:tabs>
-        <w:ind w:start="0" w:hanging="0"/>
+        <w:ind w:left="0" w:firstLine="0"/>
       </w:pPr>
     </w:lvl>
     <w:lvl w:ilvl="4">
@@ -1958,12 +2276,12 @@
       <w:numFmt w:val="none"/>
       <w:suff w:val="nothing"/>
       <w:lvlText w:val=""/>
-      <w:lvlJc w:val="start"/>
+      <w:lvlJc w:val="left"/>
       <w:pPr>
         <w:tabs>
           <w:tab w:val="num" w:pos="0"/>
         </w:tabs>
-        <w:ind w:start="0" w:hanging="0"/>
+        <w:ind w:left="0" w:firstLine="0"/>
       </w:pPr>
     </w:lvl>
     <w:lvl w:ilvl="5">
@@ -1971,12 +2289,12 @@
       <w:numFmt w:val="none"/>
       <w:suff w:val="nothing"/>
       <w:lvlText w:val=""/>
-      <w:lvlJc w:val="start"/>
+      <w:lvlJc w:val="left"/>
       <w:pPr>
         <w:tabs>
           <w:tab w:val="num" w:pos="0"/>
         </w:tabs>
-        <w:ind w:start="0" w:hanging="0"/>
+        <w:ind w:left="0" w:firstLine="0"/>
       </w:pPr>
     </w:lvl>
     <w:lvl w:ilvl="6">
@@ -1984,12 +2302,12 @@
       <w:numFmt w:val="none"/>
       <w:suff w:val="nothing"/>
       <w:lvlText w:val=""/>
-      <w:lvlJc w:val="start"/>
+      <w:lvlJc w:val="left"/>
       <w:pPr>
         <w:tabs>
           <w:tab w:val="num" w:pos="0"/>
         </w:tabs>
-        <w:ind w:start="0" w:hanging="0"/>
+        <w:ind w:left="0" w:firstLine="0"/>
       </w:pPr>
     </w:lvl>
     <w:lvl w:ilvl="7">
@@ -1997,12 +2315,12 @@
       <w:numFmt w:val="none"/>
       <w:suff w:val="nothing"/>
       <w:lvlText w:val=""/>
-      <w:lvlJc w:val="start"/>
+      <w:lvlJc w:val="left"/>
       <w:pPr>
         <w:tabs>
           <w:tab w:val="num" w:pos="0"/>
         </w:tabs>
-        <w:ind w:start="0" w:hanging="0"/>
+        <w:ind w:left="0" w:firstLine="0"/>
       </w:pPr>
     </w:lvl>
     <w:lvl w:ilvl="8">
@@ -2010,50 +2328,50 @@
       <w:numFmt w:val="none"/>
       <w:suff w:val="nothing"/>
       <w:lvlText w:val=""/>
-      <w:lvlJc w:val="start"/>
+      <w:lvlJc w:val="left"/>
       <w:pPr>
         <w:tabs>
           <w:tab w:val="num" w:pos="0"/>
         </w:tabs>
-        <w:ind w:start="0" w:hanging="0"/>
+        <w:ind w:left="0" w:firstLine="0"/>
       </w:pPr>
     </w:lvl>
   </w:abstractNum>
-  <w:num w:numId="1">
+  <w:num w:numId="1" w16cid:durableId="2100178792">
+    <w:abstractNumId w:val="0"/>
+  </w:num>
+  <w:num w:numId="2" w16cid:durableId="366610807">
     <w:abstractNumId w:val="1"/>
-  </w:num>
-  <w:num w:numId="2">
-    <w:abstractNumId w:val="2"/>
   </w:num>
 </w:numbering>
 </file>
 
 <file path=word/styles.xml><?xml version="1.0" encoding="utf-8"?>
-<w:styles xmlns:w="http://schemas.openxmlformats.org/wordprocessingml/2006/main" xmlns:w14="http://schemas.microsoft.com/office/word/2010/wordml" xmlns:mc="http://schemas.openxmlformats.org/markup-compatibility/2006" mc:Ignorable="w14">
+<w:styles xmlns:mc="http://schemas.openxmlformats.org/markup-compatibility/2006" xmlns:r="http://schemas.openxmlformats.org/officeDocument/2006/relationships" xmlns:w="http://schemas.openxmlformats.org/wordprocessingml/2006/main" xmlns:w14="http://schemas.microsoft.com/office/word/2010/wordml" xmlns:w15="http://schemas.microsoft.com/office/word/2012/wordml" xmlns:w16cex="http://schemas.microsoft.com/office/word/2018/wordml/cex" xmlns:w16cid="http://schemas.microsoft.com/office/word/2016/wordml/cid" xmlns:w16="http://schemas.microsoft.com/office/word/2018/wordml" xmlns:w16du="http://schemas.microsoft.com/office/word/2023/wordml/word16du" xmlns:w16sdtdh="http://schemas.microsoft.com/office/word/2020/wordml/sdtdatahash" xmlns:w16sdtfl="http://schemas.microsoft.com/office/word/2024/wordml/sdtformatlock" xmlns:w16se="http://schemas.microsoft.com/office/word/2015/wordml/symex" mc:Ignorable="w14 w15 w16se w16cid w16 w16cex w16sdtdh w16sdtfl w16du">
   <w:docDefaults>
     <w:rPrDefault>
       <w:rPr>
-        <w:rFonts w:ascii="Times New Roman" w:hAnsi="Times New Roman" w:eastAsia="Times New Roman" w:cs="Times New Roman"/>
+        <w:rFonts w:ascii="Times New Roman" w:eastAsia="Times New Roman" w:hAnsi="Times New Roman" w:cs="Times New Roman"/>
         <w:lang w:val="de-DE" w:eastAsia="de-DE" w:bidi="ar-SA"/>
       </w:rPr>
     </w:rPrDefault>
     <w:pPrDefault>
       <w:pPr>
-        <w:suppressAutoHyphens w:val="true"/>
+        <w:suppressAutoHyphens/>
       </w:pPr>
     </w:pPrDefault>
   </w:docDefaults>
   <w:latentStyles w:defLockedState="0" w:defUIPriority="99" w:defSemiHidden="0" w:defUnhideWhenUsed="0" w:defQFormat="0" w:count="376">
     <w:lsdException w:name="Normal" w:uiPriority="0" w:qFormat="1"/>
     <w:lsdException w:name="heading 1" w:uiPriority="9" w:qFormat="1"/>
-    <w:lsdException w:name="heading 2" w:uiPriority="9" w:semiHidden="1" w:unhideWhenUsed="1" w:qFormat="1"/>
-    <w:lsdException w:name="heading 3" w:uiPriority="9" w:semiHidden="1" w:unhideWhenUsed="1" w:qFormat="1"/>
-    <w:lsdException w:name="heading 4" w:uiPriority="9" w:semiHidden="1" w:unhideWhenUsed="1" w:qFormat="1"/>
-    <w:lsdException w:name="heading 5" w:uiPriority="9" w:semiHidden="1" w:unhideWhenUsed="1" w:qFormat="1"/>
-    <w:lsdException w:name="heading 6" w:uiPriority="9" w:semiHidden="1" w:unhideWhenUsed="1" w:qFormat="1"/>
-    <w:lsdException w:name="heading 7" w:uiPriority="9" w:semiHidden="1" w:unhideWhenUsed="1" w:qFormat="1"/>
-    <w:lsdException w:name="heading 8" w:uiPriority="9" w:semiHidden="1" w:unhideWhenUsed="1" w:qFormat="1"/>
-    <w:lsdException w:name="heading 9" w:uiPriority="9" w:semiHidden="1" w:unhideWhenUsed="1" w:qFormat="1"/>
+    <w:lsdException w:name="heading 2" w:semiHidden="1" w:uiPriority="9" w:unhideWhenUsed="1" w:qFormat="1"/>
+    <w:lsdException w:name="heading 3" w:semiHidden="1" w:uiPriority="9" w:unhideWhenUsed="1" w:qFormat="1"/>
+    <w:lsdException w:name="heading 4" w:semiHidden="1" w:uiPriority="9" w:unhideWhenUsed="1" w:qFormat="1"/>
+    <w:lsdException w:name="heading 5" w:semiHidden="1" w:uiPriority="9" w:unhideWhenUsed="1" w:qFormat="1"/>
+    <w:lsdException w:name="heading 6" w:semiHidden="1" w:uiPriority="9" w:unhideWhenUsed="1" w:qFormat="1"/>
+    <w:lsdException w:name="heading 7" w:semiHidden="1" w:uiPriority="9" w:unhideWhenUsed="1" w:qFormat="1"/>
+    <w:lsdException w:name="heading 8" w:semiHidden="1" w:uiPriority="9" w:unhideWhenUsed="1" w:qFormat="1"/>
+    <w:lsdException w:name="heading 9" w:semiHidden="1" w:uiPriority="9" w:unhideWhenUsed="1" w:qFormat="1"/>
     <w:lsdException w:name="index 1" w:semiHidden="1" w:unhideWhenUsed="1"/>
     <w:lsdException w:name="index 2" w:semiHidden="1" w:unhideWhenUsed="1"/>
     <w:lsdException w:name="index 3" w:semiHidden="1" w:unhideWhenUsed="1"/>
@@ -2063,22 +2381,22 @@
     <w:lsdException w:name="index 7" w:semiHidden="1" w:unhideWhenUsed="1"/>
     <w:lsdException w:name="index 8" w:semiHidden="1" w:unhideWhenUsed="1"/>
     <w:lsdException w:name="index 9" w:semiHidden="1" w:unhideWhenUsed="1"/>
-    <w:lsdException w:name="toc 1" w:uiPriority="39" w:semiHidden="1" w:unhideWhenUsed="1"/>
-    <w:lsdException w:name="toc 2" w:uiPriority="39" w:semiHidden="1" w:unhideWhenUsed="1"/>
-    <w:lsdException w:name="toc 3" w:uiPriority="39" w:semiHidden="1" w:unhideWhenUsed="1"/>
-    <w:lsdException w:name="toc 4" w:uiPriority="39" w:semiHidden="1" w:unhideWhenUsed="1"/>
-    <w:lsdException w:name="toc 5" w:uiPriority="39" w:semiHidden="1" w:unhideWhenUsed="1"/>
-    <w:lsdException w:name="toc 6" w:uiPriority="39" w:semiHidden="1" w:unhideWhenUsed="1"/>
-    <w:lsdException w:name="toc 7" w:uiPriority="39" w:semiHidden="1" w:unhideWhenUsed="1"/>
-    <w:lsdException w:name="toc 8" w:uiPriority="39" w:semiHidden="1" w:unhideWhenUsed="1"/>
-    <w:lsdException w:name="toc 9" w:uiPriority="39" w:semiHidden="1" w:unhideWhenUsed="1"/>
+    <w:lsdException w:name="toc 1" w:semiHidden="1" w:uiPriority="39" w:unhideWhenUsed="1"/>
+    <w:lsdException w:name="toc 2" w:semiHidden="1" w:uiPriority="39" w:unhideWhenUsed="1"/>
+    <w:lsdException w:name="toc 3" w:semiHidden="1" w:uiPriority="39" w:unhideWhenUsed="1"/>
+    <w:lsdException w:name="toc 4" w:semiHidden="1" w:uiPriority="39" w:unhideWhenUsed="1"/>
+    <w:lsdException w:name="toc 5" w:semiHidden="1" w:uiPriority="39" w:unhideWhenUsed="1"/>
+    <w:lsdException w:name="toc 6" w:semiHidden="1" w:uiPriority="39" w:unhideWhenUsed="1"/>
+    <w:lsdException w:name="toc 7" w:semiHidden="1" w:uiPriority="39" w:unhideWhenUsed="1"/>
+    <w:lsdException w:name="toc 8" w:semiHidden="1" w:uiPriority="39" w:unhideWhenUsed="1"/>
+    <w:lsdException w:name="toc 9" w:semiHidden="1" w:uiPriority="39" w:unhideWhenUsed="1"/>
     <w:lsdException w:name="Normal Indent" w:semiHidden="1" w:unhideWhenUsed="1"/>
     <w:lsdException w:name="footnote text" w:semiHidden="1" w:unhideWhenUsed="1"/>
     <w:lsdException w:name="annotation text" w:semiHidden="1" w:unhideWhenUsed="1"/>
     <w:lsdException w:name="header" w:semiHidden="1" w:unhideWhenUsed="1"/>
     <w:lsdException w:name="footer" w:semiHidden="1" w:unhideWhenUsed="1"/>
     <w:lsdException w:name="index heading" w:semiHidden="1" w:unhideWhenUsed="1"/>
-    <w:lsdException w:name="caption" w:uiPriority="35" w:semiHidden="1" w:unhideWhenUsed="1" w:qFormat="1"/>
+    <w:lsdException w:name="caption" w:semiHidden="1" w:uiPriority="35" w:unhideWhenUsed="1" w:qFormat="1"/>
     <w:lsdException w:name="table of figures" w:semiHidden="1" w:unhideWhenUsed="1"/>
     <w:lsdException w:name="envelope address" w:semiHidden="1" w:unhideWhenUsed="1"/>
     <w:lsdException w:name="envelope return" w:semiHidden="1" w:unhideWhenUsed="1"/>
@@ -2109,7 +2427,7 @@
     <w:lsdException w:name="Title" w:uiPriority="10" w:qFormat="1"/>
     <w:lsdException w:name="Closing" w:semiHidden="1" w:unhideWhenUsed="1"/>
     <w:lsdException w:name="Signature" w:semiHidden="1" w:unhideWhenUsed="1"/>
-    <w:lsdException w:name="Default Paragraph Font" w:uiPriority="1" w:semiHidden="1" w:unhideWhenUsed="1"/>
+    <w:lsdException w:name="Default Paragraph Font" w:semiHidden="1" w:uiPriority="1" w:unhideWhenUsed="1"/>
     <w:lsdException w:name="Body Text" w:semiHidden="1" w:unhideWhenUsed="1"/>
     <w:lsdException w:name="Body Text Indent" w:semiHidden="1" w:unhideWhenUsed="1"/>
     <w:lsdException w:name="List Continue" w:semiHidden="1" w:unhideWhenUsed="1"/>
@@ -2309,8 +2627,8 @@
     <w:lsdException w:name="Subtle Reference" w:uiPriority="31" w:qFormat="1"/>
     <w:lsdException w:name="Intense Reference" w:uiPriority="32" w:qFormat="1"/>
     <w:lsdException w:name="Book Title" w:uiPriority="33" w:qFormat="1"/>
-    <w:lsdException w:name="Bibliography" w:uiPriority="37" w:semiHidden="1" w:unhideWhenUsed="1"/>
-    <w:lsdException w:name="TOC Heading" w:uiPriority="39" w:semiHidden="1" w:unhideWhenUsed="1" w:qFormat="1"/>
+    <w:lsdException w:name="Bibliography" w:semiHidden="1" w:uiPriority="37" w:unhideWhenUsed="1"/>
+    <w:lsdException w:name="TOC Heading" w:semiHidden="1" w:uiPriority="39" w:unhideWhenUsed="1" w:qFormat="1"/>
     <w:lsdException w:name="Plain Table 1" w:uiPriority="41"/>
     <w:lsdException w:name="Plain Table 2" w:uiPriority="42"/>
     <w:lsdException w:name="Plain Table 3" w:uiPriority="43"/>
@@ -2421,40 +2739,32 @@
     <w:lsdException w:name="Unresolved Mention" w:semiHidden="1" w:unhideWhenUsed="1"/>
     <w:lsdException w:name="Smart Link" w:semiHidden="1" w:unhideWhenUsed="1"/>
   </w:latentStyles>
-  <w:style w:type="paragraph" w:styleId="Normal" w:default="1">
+  <w:style w:type="paragraph" w:default="1" w:styleId="Standard">
     <w:name w:val="Normal"/>
     <w:qFormat/>
     <w:pPr>
-      <w:widowControl/>
-      <w:suppressAutoHyphens w:val="false"/>
-      <w:bidi w:val="0"/>
-      <w:spacing w:before="0" w:after="0"/>
-      <w:jc w:val="start"/>
+      <w:suppressAutoHyphens w:val="0"/>
     </w:pPr>
     <w:rPr>
-      <w:rFonts w:ascii="Arial" w:hAnsi="Arial" w:eastAsia="Times New Roman" w:cs="Times New Roman"/>
-      <w:color w:val="auto"/>
-      <w:kern w:val="0"/>
+      <w:rFonts w:ascii="Arial" w:hAnsi="Arial"/>
       <w:sz w:val="24"/>
-      <w:szCs w:val="20"/>
-      <w:lang w:val="de-DE" w:eastAsia="de-DE" w:bidi="ar-SA"/>
-    </w:rPr>
-  </w:style>
-  <w:style w:type="paragraph" w:styleId="Heading1">
+    </w:rPr>
+  </w:style>
+  <w:style w:type="paragraph" w:styleId="berschrift1">
     <w:name w:val="heading 1"/>
-    <w:basedOn w:val="Normal"/>
-    <w:next w:val="Normal"/>
+    <w:basedOn w:val="Standard"/>
+    <w:next w:val="Standard"/>
     <w:link w:val="berschrift1Zchn"/>
     <w:uiPriority w:val="9"/>
     <w:qFormat/>
-    <w:rsid w:val="0022420a"/>
+    <w:rsid w:val="0022420A"/>
     <w:pPr>
-      <w:keepNext w:val="true"/>
+      <w:keepNext/>
       <w:spacing w:before="240" w:after="60"/>
       <w:outlineLvl w:val="0"/>
     </w:pPr>
     <w:rPr>
-      <w:rFonts w:ascii="Calibri Light" w:hAnsi="Calibri Light" w:eastAsia="Calibri Light" w:cs="Calibri Light"/>
+      <w:rFonts w:ascii="Calibri Light" w:eastAsia="Calibri Light" w:hAnsi="Calibri Light" w:cs="Calibri Light"/>
       <w:b/>
       <w:bCs/>
       <w:kern w:val="2"/>
@@ -2462,59 +2772,78 @@
       <w:szCs w:val="32"/>
     </w:rPr>
   </w:style>
-  <w:style w:type="paragraph" w:styleId="Heading3">
+  <w:style w:type="paragraph" w:styleId="berschrift3">
     <w:name w:val="heading 3"/>
-    <w:basedOn w:val="Normal"/>
-    <w:next w:val="Normal"/>
+    <w:basedOn w:val="Standard"/>
+    <w:next w:val="Standard"/>
     <w:link w:val="berschrift3Zchn"/>
     <w:uiPriority w:val="9"/>
     <w:unhideWhenUsed/>
     <w:qFormat/>
-    <w:rsid w:val="0022420a"/>
+    <w:rsid w:val="0022420A"/>
     <w:pPr>
-      <w:keepNext w:val="true"/>
+      <w:keepNext/>
       <w:spacing w:before="240" w:after="60"/>
       <w:outlineLvl w:val="2"/>
     </w:pPr>
     <w:rPr>
-      <w:rFonts w:ascii="Calibri Light" w:hAnsi="Calibri Light" w:eastAsia="Calibri Light" w:cs="Calibri Light"/>
+      <w:rFonts w:ascii="Calibri Light" w:eastAsia="Calibri Light" w:hAnsi="Calibri Light" w:cs="Calibri Light"/>
       <w:b/>
       <w:bCs/>
       <w:sz w:val="26"/>
       <w:szCs w:val="26"/>
     </w:rPr>
   </w:style>
-  <w:style w:type="character" w:styleId="DefaultParagraphFont" w:default="1">
+  <w:style w:type="character" w:default="1" w:styleId="Absatz-Standardschriftart">
     <w:name w:val="Default Paragraph Font"/>
     <w:uiPriority w:val="1"/>
     <w:semiHidden/>
     <w:unhideWhenUsed/>
-    <w:qFormat/>
-    <w:rPr/>
-  </w:style>
-  <w:style w:type="character" w:styleId="FunotentextZchn" w:customStyle="1">
+  </w:style>
+  <w:style w:type="table" w:default="1" w:styleId="NormaleTabelle">
+    <w:name w:val="Normal Table"/>
+    <w:uiPriority w:val="99"/>
+    <w:semiHidden/>
+    <w:unhideWhenUsed/>
+    <w:tblPr>
+      <w:tblInd w:w="0" w:type="dxa"/>
+      <w:tblCellMar>
+        <w:top w:w="0" w:type="dxa"/>
+        <w:left w:w="108" w:type="dxa"/>
+        <w:bottom w:w="0" w:type="dxa"/>
+        <w:right w:w="108" w:type="dxa"/>
+      </w:tblCellMar>
+    </w:tblPr>
+  </w:style>
+  <w:style w:type="numbering" w:default="1" w:styleId="KeineListe">
+    <w:name w:val="No List"/>
+    <w:uiPriority w:val="99"/>
+    <w:semiHidden/>
+    <w:unhideWhenUsed/>
+  </w:style>
+  <w:style w:type="character" w:customStyle="1" w:styleId="FunotentextZchn">
     <w:name w:val="Fußnotentext Zchn"/>
-    <w:link w:val="FootnoteText"/>
+    <w:link w:val="Funotentext"/>
     <w:semiHidden/>
     <w:qFormat/>
     <w:locked/>
-    <w:rsid w:val="00a85c82"/>
+    <w:rsid w:val="00A85C82"/>
     <w:rPr>
       <w:rFonts w:ascii="Arial" w:hAnsi="Arial"/>
       <w:lang w:val="de-DE" w:eastAsia="de-DE" w:bidi="ar-SA"/>
     </w:rPr>
   </w:style>
-  <w:style w:type="character" w:styleId="FootnoteCharacters" w:customStyle="1">
+  <w:style w:type="character" w:customStyle="1" w:styleId="FootnoteCharacters">
     <w:name w:val="Footnote Characters"/>
     <w:semiHidden/>
     <w:qFormat/>
-    <w:rsid w:val="00a85c82"/>
+    <w:rsid w:val="00A85C82"/>
     <w:rPr>
       <w:rFonts w:cs="Times New Roman"/>
       <w:vertAlign w:val="superscript"/>
     </w:rPr>
   </w:style>
-  <w:style w:type="character" w:styleId="Funotenzeichen1" w:customStyle="1">
+  <w:style w:type="character" w:customStyle="1" w:styleId="Funotenzeichen1">
     <w:name w:val="Fußnotenzeichen1"/>
     <w:qFormat/>
     <w:rPr>
@@ -2522,92 +2851,91 @@
       <w:vertAlign w:val="superscript"/>
     </w:rPr>
   </w:style>
-  <w:style w:type="character" w:styleId="Hyperlink1" w:customStyle="1">
+  <w:style w:type="character" w:customStyle="1" w:styleId="Hyperlink1">
     <w:name w:val="Hyperlink1"/>
     <w:uiPriority w:val="99"/>
     <w:unhideWhenUsed/>
     <w:qFormat/>
-    <w:rsid w:val="007d2589"/>
+    <w:rsid w:val="007D2589"/>
     <w:rPr>
       <w:color w:val="0563C1"/>
       <w:u w:val="single"/>
     </w:rPr>
   </w:style>
-  <w:style w:type="character" w:styleId="DefaultParagraphFontPHPDOCX" w:customStyle="1">
+  <w:style w:type="character" w:customStyle="1" w:styleId="DefaultParagraphFontPHPDOCX">
     <w:name w:val="Default Paragraph Font PHPDOCX"/>
     <w:uiPriority w:val="1"/>
     <w:semiHidden/>
     <w:unhideWhenUsed/>
     <w:qFormat/>
-    <w:rPr/>
-  </w:style>
-  <w:style w:type="character" w:styleId="TitleCarPHPDOCX" w:customStyle="1">
+  </w:style>
+  <w:style w:type="character" w:customStyle="1" w:styleId="TitleCarPHPDOCX">
     <w:name w:val="Title Car PHPDOCX"/>
     <w:basedOn w:val="DefaultParagraphFontPHPDOCX"/>
     <w:link w:val="TitlePHPDOCX"/>
     <w:uiPriority w:val="10"/>
     <w:qFormat/>
-    <w:rsid w:val="00df064e"/>
-    <w:rPr>
-      <w:rFonts w:ascii="Calibri Light" w:hAnsi="Calibri Light" w:eastAsia="" w:cs="" w:asciiTheme="majorHAnsi" w:cstheme="majorBidi" w:eastAsiaTheme="majorEastAsia" w:hAnsiTheme="majorHAnsi"/>
-      <w:color w:themeColor="text2" w:themeShade="bf" w:val="323E4F"/>
+    <w:rsid w:val="00DF064E"/>
+    <w:rPr>
+      <w:rFonts w:asciiTheme="majorHAnsi" w:eastAsiaTheme="majorEastAsia" w:hAnsiTheme="majorHAnsi" w:cstheme="majorBidi"/>
+      <w:color w:val="323E4F" w:themeColor="text2" w:themeShade="BF"/>
       <w:spacing w:val="5"/>
       <w:kern w:val="2"/>
       <w:sz w:val="52"/>
       <w:szCs w:val="52"/>
     </w:rPr>
   </w:style>
-  <w:style w:type="character" w:styleId="SubtitleCarPHPDOCX" w:customStyle="1">
+  <w:style w:type="character" w:customStyle="1" w:styleId="SubtitleCarPHPDOCX">
     <w:name w:val="Subtitle Car PHPDOCX"/>
     <w:basedOn w:val="DefaultParagraphFontPHPDOCX"/>
     <w:link w:val="SubtitlePHPDOCX"/>
     <w:uiPriority w:val="11"/>
     <w:qFormat/>
-    <w:rsid w:val="00df064e"/>
-    <w:rPr>
-      <w:rFonts w:ascii="Calibri Light" w:hAnsi="Calibri Light" w:eastAsia="" w:cs="" w:asciiTheme="majorHAnsi" w:cstheme="majorBidi" w:eastAsiaTheme="majorEastAsia" w:hAnsiTheme="majorHAnsi"/>
+    <w:rsid w:val="00DF064E"/>
+    <w:rPr>
+      <w:rFonts w:asciiTheme="majorHAnsi" w:eastAsiaTheme="majorEastAsia" w:hAnsiTheme="majorHAnsi" w:cstheme="majorBidi"/>
       <w:i/>
       <w:iCs/>
-      <w:color w:themeColor="accent1" w:val="4472C4"/>
+      <w:color w:val="4472C4" w:themeColor="accent1"/>
       <w:spacing w:val="15"/>
       <w:sz w:val="24"/>
       <w:szCs w:val="24"/>
     </w:rPr>
   </w:style>
-  <w:style w:type="character" w:styleId="annotationreferencePHPDOCX" w:customStyle="1">
+  <w:style w:type="character" w:customStyle="1" w:styleId="annotationreferencePHPDOCX">
     <w:name w:val="annotation reference PHPDOCX"/>
     <w:basedOn w:val="DefaultParagraphFontPHPDOCX"/>
     <w:uiPriority w:val="99"/>
     <w:semiHidden/>
     <w:unhideWhenUsed/>
     <w:qFormat/>
-    <w:rsid w:val="00e139ea"/>
+    <w:rsid w:val="00E139EA"/>
     <w:rPr>
       <w:sz w:val="16"/>
       <w:szCs w:val="16"/>
     </w:rPr>
   </w:style>
-  <w:style w:type="character" w:styleId="CommentTextCharPHPDOCX" w:customStyle="1">
+  <w:style w:type="character" w:customStyle="1" w:styleId="CommentTextCharPHPDOCX">
     <w:name w:val="Comment Text Char PHPDOCX"/>
     <w:basedOn w:val="DefaultParagraphFontPHPDOCX"/>
     <w:link w:val="annotationtextPHPDOCX"/>
     <w:uiPriority w:val="99"/>
     <w:semiHidden/>
     <w:qFormat/>
-    <w:rsid w:val="00e139ea"/>
+    <w:rsid w:val="00E139EA"/>
     <w:rPr>
       <w:sz w:val="20"/>
       <w:szCs w:val="20"/>
     </w:rPr>
   </w:style>
-  <w:style w:type="character" w:styleId="CommentSubjectCharPHPDOCX" w:customStyle="1">
+  <w:style w:type="character" w:customStyle="1" w:styleId="CommentSubjectCharPHPDOCX">
     <w:name w:val="Comment Subject Char PHPDOCX"/>
     <w:basedOn w:val="CommentTextCharPHPDOCX"/>
     <w:link w:val="annotationsubjectPHPDOCX"/>
     <w:uiPriority w:val="99"/>
     <w:semiHidden/>
     <w:qFormat/>
-    <w:rsid w:val="00e139ea"/>
+    <w:rsid w:val="00E139EA"/>
     <w:rPr>
       <w:b/>
       <w:bCs/>
@@ -2615,90 +2943,89 @@
       <w:szCs w:val="20"/>
     </w:rPr>
   </w:style>
-  <w:style w:type="character" w:styleId="BalloonTextCharPHPDOCX" w:customStyle="1">
+  <w:style w:type="character" w:customStyle="1" w:styleId="BalloonTextCharPHPDOCX">
     <w:name w:val="Balloon Text Char PHPDOCX"/>
     <w:basedOn w:val="DefaultParagraphFontPHPDOCX"/>
     <w:link w:val="BalloonTextPHPDOCX"/>
     <w:uiPriority w:val="99"/>
     <w:semiHidden/>
     <w:qFormat/>
-    <w:rsid w:val="00e139ea"/>
+    <w:rsid w:val="00E139EA"/>
     <w:rPr>
       <w:rFonts w:ascii="Tahoma" w:hAnsi="Tahoma" w:cs="Tahoma"/>
       <w:sz w:val="16"/>
       <w:szCs w:val="16"/>
     </w:rPr>
   </w:style>
-  <w:style w:type="character" w:styleId="footnoteTextCarPHPDOCX" w:customStyle="1">
+  <w:style w:type="character" w:customStyle="1" w:styleId="footnoteTextCarPHPDOCX">
     <w:name w:val="footnote Text Car PHPDOCX"/>
     <w:basedOn w:val="DefaultParagraphFontPHPDOCX"/>
     <w:link w:val="footnoteTextPHPDOCX"/>
     <w:uiPriority w:val="99"/>
     <w:semiHidden/>
     <w:qFormat/>
-    <w:rsid w:val="006e0fda"/>
+    <w:rsid w:val="006E0FDA"/>
     <w:rPr>
       <w:sz w:val="20"/>
       <w:szCs w:val="20"/>
     </w:rPr>
   </w:style>
-  <w:style w:type="character" w:styleId="footnoteReferencePHPDOCX" w:customStyle="1">
+  <w:style w:type="character" w:customStyle="1" w:styleId="footnoteReferencePHPDOCX">
     <w:name w:val="footnote Reference PHPDOCX"/>
     <w:basedOn w:val="DefaultParagraphFontPHPDOCX"/>
     <w:uiPriority w:val="99"/>
     <w:semiHidden/>
     <w:unhideWhenUsed/>
     <w:qFormat/>
-    <w:rsid w:val="006e0fda"/>
+    <w:rsid w:val="006E0FDA"/>
     <w:rPr>
       <w:vertAlign w:val="superscript"/>
     </w:rPr>
   </w:style>
-  <w:style w:type="character" w:styleId="endnoteTextCarPHPDOCX" w:customStyle="1">
+  <w:style w:type="character" w:customStyle="1" w:styleId="endnoteTextCarPHPDOCX">
     <w:name w:val="endnote Text Car PHPDOCX"/>
     <w:basedOn w:val="DefaultParagraphFontPHPDOCX"/>
     <w:link w:val="endnoteTextPHPDOCX"/>
     <w:uiPriority w:val="99"/>
     <w:semiHidden/>
     <w:qFormat/>
-    <w:rsid w:val="006e0fda"/>
+    <w:rsid w:val="006E0FDA"/>
     <w:rPr>
       <w:sz w:val="20"/>
       <w:szCs w:val="20"/>
     </w:rPr>
   </w:style>
-  <w:style w:type="character" w:styleId="endnoteReferencePHPDOCX" w:customStyle="1">
+  <w:style w:type="character" w:customStyle="1" w:styleId="endnoteReferencePHPDOCX">
     <w:name w:val="endnote Reference PHPDOCX"/>
     <w:basedOn w:val="DefaultParagraphFontPHPDOCX"/>
     <w:uiPriority w:val="99"/>
     <w:semiHidden/>
     <w:unhideWhenUsed/>
     <w:qFormat/>
-    <w:rsid w:val="006e0fda"/>
+    <w:rsid w:val="006E0FDA"/>
     <w:rPr>
       <w:vertAlign w:val="superscript"/>
     </w:rPr>
   </w:style>
-  <w:style w:type="character" w:styleId="Endnotenzeichen1" w:customStyle="1">
+  <w:style w:type="character" w:customStyle="1" w:styleId="Endnotenzeichen1">
     <w:name w:val="Endnotenzeichen1"/>
     <w:qFormat/>
     <w:rPr>
       <w:vertAlign w:val="superscript"/>
     </w:rPr>
   </w:style>
-  <w:style w:type="character" w:styleId="EndnoteCharacters" w:customStyle="1">
+  <w:style w:type="character" w:customStyle="1" w:styleId="EndnoteCharacters">
     <w:name w:val="Endnote Characters"/>
     <w:qFormat/>
-    <w:rPr/>
-  </w:style>
-  <w:style w:type="character" w:styleId="berschrift1Zchn" w:customStyle="1">
+  </w:style>
+  <w:style w:type="character" w:customStyle="1" w:styleId="berschrift1Zchn">
     <w:name w:val="Überschrift 1 Zchn"/>
-    <w:link w:val="Heading1"/>
+    <w:link w:val="berschrift1"/>
     <w:uiPriority w:val="9"/>
     <w:qFormat/>
-    <w:rsid w:val="0022420a"/>
-    <w:rPr>
-      <w:rFonts w:ascii="Calibri Light" w:hAnsi="Calibri Light" w:eastAsia="Calibri Light" w:cs="Calibri Light"/>
+    <w:rsid w:val="0022420A"/>
+    <w:rPr>
+      <w:rFonts w:ascii="Calibri Light" w:eastAsia="Calibri Light" w:hAnsi="Calibri Light" w:cs="Calibri Light"/>
       <w:b/>
       <w:bCs/>
       <w:kern w:val="2"/>
@@ -2706,54 +3033,52 @@
       <w:szCs w:val="32"/>
     </w:rPr>
   </w:style>
-  <w:style w:type="character" w:styleId="berschrift3Zchn" w:customStyle="1">
+  <w:style w:type="character" w:customStyle="1" w:styleId="berschrift3Zchn">
     <w:name w:val="Überschrift 3 Zchn"/>
-    <w:link w:val="Heading3"/>
+    <w:link w:val="berschrift3"/>
     <w:uiPriority w:val="9"/>
     <w:qFormat/>
-    <w:rsid w:val="0022420a"/>
-    <w:rPr>
-      <w:rFonts w:ascii="Calibri Light" w:hAnsi="Calibri Light" w:eastAsia="Calibri Light" w:cs="Calibri Light"/>
+    <w:rsid w:val="0022420A"/>
+    <w:rPr>
+      <w:rFonts w:ascii="Calibri Light" w:eastAsia="Calibri Light" w:hAnsi="Calibri Light" w:cs="Calibri Light"/>
       <w:b/>
       <w:bCs/>
       <w:sz w:val="26"/>
       <w:szCs w:val="26"/>
     </w:rPr>
   </w:style>
-  <w:style w:type="paragraph" w:styleId="Heading" w:customStyle="1">
+  <w:style w:type="paragraph" w:customStyle="1" w:styleId="Heading">
     <w:name w:val="Heading"/>
-    <w:basedOn w:val="Normal"/>
-    <w:next w:val="BodyText"/>
+    <w:basedOn w:val="Standard"/>
+    <w:next w:val="Textkrper"/>
     <w:qFormat/>
     <w:pPr>
-      <w:keepNext w:val="true"/>
+      <w:keepNext/>
       <w:spacing w:before="240" w:after="120"/>
     </w:pPr>
     <w:rPr>
-      <w:rFonts w:ascii="Liberation Sans" w:hAnsi="Liberation Sans" w:eastAsia="Microsoft YaHei" w:cs="Mangal"/>
+      <w:rFonts w:ascii="Liberation Sans" w:eastAsia="Microsoft YaHei" w:hAnsi="Liberation Sans" w:cs="Mangal"/>
       <w:sz w:val="28"/>
       <w:szCs w:val="28"/>
     </w:rPr>
   </w:style>
-  <w:style w:type="paragraph" w:styleId="BodyText">
+  <w:style w:type="paragraph" w:styleId="Textkrper">
     <w:name w:val="Body Text"/>
-    <w:basedOn w:val="Normal"/>
+    <w:basedOn w:val="Standard"/>
     <w:pPr>
-      <w:spacing w:lineRule="auto" w:line="276" w:before="0" w:after="140"/>
+      <w:spacing w:after="140" w:line="276" w:lineRule="auto"/>
     </w:pPr>
-    <w:rPr/>
-  </w:style>
-  <w:style w:type="paragraph" w:styleId="List">
+  </w:style>
+  <w:style w:type="paragraph" w:styleId="Liste">
     <w:name w:val="List"/>
-    <w:basedOn w:val="BodyText"/>
-    <w:pPr/>
+    <w:basedOn w:val="Textkrper"/>
     <w:rPr>
       <w:rFonts w:cs="Mangal"/>
     </w:rPr>
   </w:style>
-  <w:style w:type="paragraph" w:styleId="Caption">
+  <w:style w:type="paragraph" w:styleId="Beschriftung">
     <w:name w:val="caption"/>
-    <w:basedOn w:val="Normal"/>
+    <w:basedOn w:val="Standard"/>
     <w:qFormat/>
     <w:pPr>
       <w:suppressLineNumbers/>
@@ -2766,9 +3091,9 @@
       <w:szCs w:val="24"/>
     </w:rPr>
   </w:style>
-  <w:style w:type="paragraph" w:styleId="Index" w:customStyle="1">
+  <w:style w:type="paragraph" w:customStyle="1" w:styleId="Index">
     <w:name w:val="Index"/>
-    <w:basedOn w:val="Normal"/>
+    <w:basedOn w:val="Standard"/>
     <w:qFormat/>
     <w:pPr>
       <w:suppressLineNumbers/>
@@ -2777,153 +3102,133 @@
       <w:rFonts w:cs="Mangal"/>
     </w:rPr>
   </w:style>
-  <w:style w:type="paragraph" w:styleId="BalloonText">
+  <w:style w:type="paragraph" w:styleId="Sprechblasentext">
     <w:name w:val="Balloon Text"/>
-    <w:basedOn w:val="Normal"/>
+    <w:basedOn w:val="Standard"/>
     <w:semiHidden/>
     <w:qFormat/>
     <w:rsid w:val="00802797"/>
-    <w:pPr/>
     <w:rPr>
       <w:rFonts w:ascii="Tahoma" w:hAnsi="Tahoma" w:cs="Tahoma"/>
       <w:sz w:val="16"/>
       <w:szCs w:val="16"/>
     </w:rPr>
   </w:style>
-  <w:style w:type="paragraph" w:styleId="HeaderandFooter" w:customStyle="1">
+  <w:style w:type="paragraph" w:customStyle="1" w:styleId="HeaderandFooter">
     <w:name w:val="Header and Footer"/>
-    <w:basedOn w:val="Normal"/>
-    <w:qFormat/>
-    <w:pPr/>
-    <w:rPr/>
-  </w:style>
-  <w:style w:type="paragraph" w:styleId="Header">
+    <w:basedOn w:val="Standard"/>
+    <w:qFormat/>
+  </w:style>
+  <w:style w:type="paragraph" w:styleId="Kopfzeile">
     <w:name w:val="header"/>
-    <w:basedOn w:val="Normal"/>
-    <w:rsid w:val="00175dbe"/>
+    <w:basedOn w:val="Standard"/>
+    <w:rsid w:val="00175DBE"/>
     <w:pPr>
       <w:tabs>
-        <w:tab w:val="clear" w:pos="708"/>
-        <w:tab w:val="center" w:pos="4536" w:leader="none"/>
-        <w:tab w:val="right" w:pos="9072" w:leader="none"/>
+        <w:tab w:val="center" w:pos="4536"/>
+        <w:tab w:val="right" w:pos="9072"/>
       </w:tabs>
     </w:pPr>
-    <w:rPr/>
-  </w:style>
-  <w:style w:type="paragraph" w:styleId="Footer">
+  </w:style>
+  <w:style w:type="paragraph" w:styleId="Fuzeile">
     <w:name w:val="footer"/>
-    <w:basedOn w:val="Normal"/>
-    <w:rsid w:val="00175dbe"/>
+    <w:basedOn w:val="Standard"/>
+    <w:rsid w:val="00175DBE"/>
     <w:pPr>
       <w:tabs>
-        <w:tab w:val="clear" w:pos="708"/>
-        <w:tab w:val="center" w:pos="4536" w:leader="none"/>
-        <w:tab w:val="right" w:pos="9072" w:leader="none"/>
+        <w:tab w:val="center" w:pos="4536"/>
+        <w:tab w:val="right" w:pos="9072"/>
       </w:tabs>
     </w:pPr>
-    <w:rPr/>
-  </w:style>
-  <w:style w:type="paragraph" w:styleId="Default" w:customStyle="1">
+  </w:style>
+  <w:style w:type="paragraph" w:customStyle="1" w:styleId="Default">
     <w:name w:val="Default"/>
     <w:qFormat/>
-    <w:rsid w:val="00a85c82"/>
-    <w:pPr>
-      <w:widowControl/>
-      <w:suppressAutoHyphens w:val="true"/>
-      <w:bidi w:val="0"/>
-      <w:spacing w:before="0" w:after="0"/>
-      <w:jc w:val="start"/>
-    </w:pPr>
-    <w:rPr>
-      <w:rFonts w:ascii="Calibri" w:hAnsi="Calibri" w:eastAsia="MS Mincho" w:cs="Calibri"/>
+    <w:rsid w:val="00A85C82"/>
+    <w:rPr>
+      <w:rFonts w:ascii="Calibri" w:eastAsia="MS Mincho" w:hAnsi="Calibri" w:cs="Calibri"/>
       <w:color w:val="000000"/>
-      <w:kern w:val="0"/>
       <w:sz w:val="24"/>
       <w:szCs w:val="24"/>
-      <w:lang w:val="de-DE" w:eastAsia="ja-JP" w:bidi="ar-SA"/>
-    </w:rPr>
-  </w:style>
-  <w:style w:type="paragraph" w:styleId="FootnoteText">
+      <w:lang w:eastAsia="ja-JP"/>
+    </w:rPr>
+  </w:style>
+  <w:style w:type="paragraph" w:styleId="Funotentext">
     <w:name w:val="footnote text"/>
-    <w:basedOn w:val="Normal"/>
+    <w:basedOn w:val="Standard"/>
     <w:link w:val="FunotentextZchn"/>
     <w:semiHidden/>
-    <w:rsid w:val="00a85c82"/>
-    <w:pPr/>
+    <w:rsid w:val="00A85C82"/>
     <w:rPr>
       <w:sz w:val="20"/>
     </w:rPr>
   </w:style>
-  <w:style w:type="paragraph" w:styleId="ListParagraphPHPDOCX" w:customStyle="1">
+  <w:style w:type="paragraph" w:customStyle="1" w:styleId="ListParagraphPHPDOCX">
     <w:name w:val="List Paragraph PHPDOCX"/>
-    <w:basedOn w:val="Normal"/>
+    <w:basedOn w:val="Standard"/>
     <w:uiPriority w:val="34"/>
     <w:qFormat/>
-    <w:rsid w:val="00df064e"/>
+    <w:rsid w:val="00DF064E"/>
     <w:pPr>
-      <w:spacing w:before="0" w:after="0"/>
-      <w:ind w:start="720"/>
+      <w:ind w:left="720"/>
       <w:contextualSpacing/>
     </w:pPr>
-    <w:rPr/>
-  </w:style>
-  <w:style w:type="paragraph" w:styleId="TitlePHPDOCX" w:customStyle="1">
+  </w:style>
+  <w:style w:type="paragraph" w:customStyle="1" w:styleId="TitlePHPDOCX">
     <w:name w:val="Title PHPDOCX"/>
-    <w:basedOn w:val="Normal"/>
-    <w:next w:val="Normal"/>
+    <w:basedOn w:val="Standard"/>
+    <w:next w:val="Standard"/>
     <w:link w:val="TitleCarPHPDOCX"/>
     <w:uiPriority w:val="10"/>
     <w:qFormat/>
-    <w:rsid w:val="00df064e"/>
+    <w:rsid w:val="00DF064E"/>
     <w:pPr>
       <w:pBdr>
         <w:bottom w:val="single" w:sz="8" w:space="4" w:color="4472C4" w:themeColor="accent1"/>
       </w:pBdr>
-      <w:spacing w:before="0" w:after="300"/>
+      <w:spacing w:after="300"/>
       <w:contextualSpacing/>
     </w:pPr>
     <w:rPr>
-      <w:rFonts w:ascii="Calibri Light" w:hAnsi="Calibri Light" w:eastAsia="" w:cs="" w:asciiTheme="majorHAnsi" w:cstheme="majorBidi" w:eastAsiaTheme="majorEastAsia" w:hAnsiTheme="majorHAnsi"/>
-      <w:color w:themeColor="text2" w:themeShade="bf" w:val="323E4F"/>
+      <w:rFonts w:asciiTheme="majorHAnsi" w:eastAsiaTheme="majorEastAsia" w:hAnsiTheme="majorHAnsi" w:cstheme="majorBidi"/>
+      <w:color w:val="323E4F" w:themeColor="text2" w:themeShade="BF"/>
       <w:spacing w:val="5"/>
       <w:kern w:val="2"/>
       <w:sz w:val="52"/>
       <w:szCs w:val="52"/>
     </w:rPr>
   </w:style>
-  <w:style w:type="paragraph" w:styleId="SubtitlePHPDOCX" w:customStyle="1">
+  <w:style w:type="paragraph" w:customStyle="1" w:styleId="SubtitlePHPDOCX">
     <w:name w:val="Subtitle PHPDOCX"/>
-    <w:basedOn w:val="Normal"/>
-    <w:next w:val="Normal"/>
+    <w:basedOn w:val="Standard"/>
+    <w:next w:val="Standard"/>
     <w:link w:val="SubtitleCarPHPDOCX"/>
     <w:uiPriority w:val="11"/>
     <w:qFormat/>
-    <w:rsid w:val="00df064e"/>
-    <w:pPr/>
-    <w:rPr>
-      <w:rFonts w:ascii="Calibri Light" w:hAnsi="Calibri Light" w:eastAsia="" w:cs="" w:asciiTheme="majorHAnsi" w:cstheme="majorBidi" w:eastAsiaTheme="majorEastAsia" w:hAnsiTheme="majorHAnsi"/>
+    <w:rsid w:val="00DF064E"/>
+    <w:rPr>
+      <w:rFonts w:asciiTheme="majorHAnsi" w:eastAsiaTheme="majorEastAsia" w:hAnsiTheme="majorHAnsi" w:cstheme="majorBidi"/>
       <w:i/>
       <w:iCs/>
-      <w:color w:themeColor="accent1" w:val="4472C4"/>
+      <w:color w:val="4472C4" w:themeColor="accent1"/>
       <w:spacing w:val="15"/>
       <w:szCs w:val="24"/>
     </w:rPr>
   </w:style>
-  <w:style w:type="paragraph" w:styleId="annotationtextPHPDOCX" w:customStyle="1">
+  <w:style w:type="paragraph" w:customStyle="1" w:styleId="annotationtextPHPDOCX">
     <w:name w:val="annotation text PHPDOCX"/>
-    <w:basedOn w:val="Normal"/>
+    <w:basedOn w:val="Standard"/>
     <w:link w:val="CommentTextCharPHPDOCX"/>
     <w:uiPriority w:val="99"/>
     <w:semiHidden/>
     <w:unhideWhenUsed/>
     <w:qFormat/>
-    <w:rsid w:val="00e139ea"/>
-    <w:pPr/>
+    <w:rsid w:val="00E139EA"/>
     <w:rPr>
       <w:sz w:val="20"/>
     </w:rPr>
   </w:style>
-  <w:style w:type="paragraph" w:styleId="annotationsubjectPHPDOCX" w:customStyle="1">
+  <w:style w:type="paragraph" w:customStyle="1" w:styleId="annotationsubjectPHPDOCX">
     <w:name w:val="annotation subject PHPDOCX"/>
     <w:basedOn w:val="annotationtextPHPDOCX"/>
     <w:next w:val="annotationtextPHPDOCX"/>
@@ -2932,94 +3237,94 @@
     <w:semiHidden/>
     <w:unhideWhenUsed/>
     <w:qFormat/>
-    <w:rsid w:val="00e139ea"/>
-    <w:pPr/>
+    <w:rsid w:val="00E139EA"/>
     <w:rPr>
       <w:b/>
       <w:bCs/>
     </w:rPr>
   </w:style>
-  <w:style w:type="paragraph" w:styleId="BalloonTextPHPDOCX" w:customStyle="1">
+  <w:style w:type="paragraph" w:customStyle="1" w:styleId="BalloonTextPHPDOCX">
     <w:name w:val="Balloon Text PHPDOCX"/>
-    <w:basedOn w:val="Normal"/>
+    <w:basedOn w:val="Standard"/>
     <w:link w:val="BalloonTextCharPHPDOCX"/>
     <w:uiPriority w:val="99"/>
     <w:semiHidden/>
     <w:unhideWhenUsed/>
     <w:qFormat/>
-    <w:rsid w:val="00e139ea"/>
-    <w:pPr/>
+    <w:rsid w:val="00E139EA"/>
     <w:rPr>
       <w:rFonts w:ascii="Tahoma" w:hAnsi="Tahoma" w:cs="Tahoma"/>
       <w:sz w:val="16"/>
       <w:szCs w:val="16"/>
     </w:rPr>
   </w:style>
-  <w:style w:type="paragraph" w:styleId="footnoteTextPHPDOCX" w:customStyle="1">
+  <w:style w:type="paragraph" w:customStyle="1" w:styleId="footnoteTextPHPDOCX">
     <w:name w:val="footnote Text PHPDOCX"/>
-    <w:basedOn w:val="Normal"/>
+    <w:basedOn w:val="Standard"/>
     <w:link w:val="footnoteTextCarPHPDOCX"/>
     <w:uiPriority w:val="99"/>
     <w:semiHidden/>
     <w:unhideWhenUsed/>
     <w:qFormat/>
-    <w:rsid w:val="006e0fda"/>
-    <w:pPr/>
+    <w:rsid w:val="006E0FDA"/>
     <w:rPr>
       <w:sz w:val="20"/>
     </w:rPr>
   </w:style>
-  <w:style w:type="paragraph" w:styleId="endnoteTextPHPDOCX" w:customStyle="1">
+  <w:style w:type="paragraph" w:customStyle="1" w:styleId="endnoteTextPHPDOCX">
     <w:name w:val="endnote Text PHPDOCX"/>
-    <w:basedOn w:val="Normal"/>
+    <w:basedOn w:val="Standard"/>
     <w:link w:val="endnoteTextCarPHPDOCX"/>
     <w:uiPriority w:val="99"/>
     <w:semiHidden/>
     <w:unhideWhenUsed/>
     <w:qFormat/>
-    <w:rsid w:val="006e0fda"/>
-    <w:pPr/>
+    <w:rsid w:val="006E0FDA"/>
     <w:rPr>
       <w:sz w:val="20"/>
     </w:rPr>
   </w:style>
-  <w:style w:type="paragraph" w:styleId="ListParagraph">
+  <w:style w:type="paragraph" w:styleId="Listenabsatz">
     <w:name w:val="List Paragraph"/>
-    <w:basedOn w:val="Normal"/>
+    <w:basedOn w:val="Standard"/>
     <w:uiPriority w:val="34"/>
     <w:qFormat/>
-    <w:rsid w:val="0034303b"/>
+    <w:rsid w:val="0034303B"/>
     <w:pPr>
-      <w:ind w:start="708"/>
+      <w:ind w:left="708"/>
     </w:pPr>
-    <w:rPr/>
-  </w:style>
-  <w:style w:type="paragraph" w:styleId="FrameContentsuser" w:customStyle="1">
+  </w:style>
+  <w:style w:type="paragraph" w:customStyle="1" w:styleId="FrameContentsuser">
     <w:name w:val="Frame Contents (user)"/>
-    <w:basedOn w:val="Normal"/>
-    <w:qFormat/>
-    <w:pPr/>
-    <w:rPr/>
-  </w:style>
-  <w:style w:type="paragraph" w:styleId="FrameContents" w:customStyle="1">
+    <w:basedOn w:val="Standard"/>
+    <w:qFormat/>
+  </w:style>
+  <w:style w:type="paragraph" w:customStyle="1" w:styleId="FrameContents">
     <w:name w:val="Frame Contents"/>
-    <w:basedOn w:val="Normal"/>
-    <w:qFormat/>
-    <w:pPr/>
-    <w:rPr/>
-  </w:style>
-  <w:style w:type="numbering" w:styleId="NoList" w:default="1">
-    <w:name w:val="No List"/>
+    <w:basedOn w:val="Standard"/>
+    <w:qFormat/>
+  </w:style>
+  <w:style w:type="table" w:styleId="Tabellenraster">
+    <w:name w:val="Table Grid"/>
+    <w:basedOn w:val="NormaleTabelle"/>
+    <w:rsid w:val="00BF2FA7"/>
+    <w:tblPr>
+      <w:tblBorders>
+        <w:top w:val="single" w:sz="4" w:space="0" w:color="auto"/>
+        <w:left w:val="single" w:sz="4" w:space="0" w:color="auto"/>
+        <w:bottom w:val="single" w:sz="4" w:space="0" w:color="auto"/>
+        <w:right w:val="single" w:sz="4" w:space="0" w:color="auto"/>
+        <w:insideH w:val="single" w:sz="4" w:space="0" w:color="auto"/>
+        <w:insideV w:val="single" w:sz="4" w:space="0" w:color="auto"/>
+      </w:tblBorders>
+    </w:tblPr>
+  </w:style>
+  <w:style w:type="table" w:customStyle="1" w:styleId="NormalTablePHPDOCX">
+    <w:name w:val="Normal Table PHPDOCX"/>
     <w:uiPriority w:val="99"/>
     <w:semiHidden/>
     <w:unhideWhenUsed/>
     <w:qFormat/>
-  </w:style>
-  <w:style w:type="table" w:default="1" w:styleId="NormaleTabelle">
-    <w:name w:val="Normal Table"/>
-    <w:uiPriority w:val="99"/>
-    <w:semiHidden/>
-    <w:unhideWhenUsed/>
     <w:tblPr>
       <w:tblCellMar>
         <w:top w:w="0" w:type="dxa"/>
@@ -3029,48 +3334,18 @@
       </w:tblCellMar>
     </w:tblPr>
   </w:style>
-  <w:style w:type="table" w:styleId="Tabellenraster">
-    <w:name w:val="Table Grid"/>
-    <w:basedOn w:val="NormaleTabelle"/>
-    <w:rsid w:val="00bf2fa7"/>
-    <w:tblPr>
-      <w:tblBorders>
-        <w:top w:val="single" w:color="auto" w:sz="4" w:space="0"/>
-        <w:left w:val="single" w:color="auto" w:sz="4" w:space="0"/>
-        <w:bottom w:val="single" w:color="auto" w:sz="4" w:space="0"/>
-        <w:right w:val="single" w:color="auto" w:sz="4" w:space="0"/>
-        <w:insideH w:val="single" w:color="auto" w:sz="4" w:space="0"/>
-        <w:insideV w:val="single" w:color="auto" w:sz="4" w:space="0"/>
-      </w:tblBorders>
-    </w:tblPr>
-  </w:style>
-  <w:style w:type="table" w:customStyle="1" w:styleId="NormalTablePHPDOCX">
-    <w:name w:val="Normal Table PHPDOCX"/>
-    <w:uiPriority w:val="99"/>
-    <w:semiHidden/>
-    <w:unhideWhenUsed/>
-    <w:qFormat/>
-    <w:tblPr>
-      <w:tblCellMar>
-        <w:top w:w="0" w:type="dxa"/>
-        <w:left w:w="108" w:type="dxa"/>
-        <w:bottom w:w="0" w:type="dxa"/>
-        <w:right w:w="108" w:type="dxa"/>
-      </w:tblCellMar>
-    </w:tblPr>
-  </w:style>
   <w:style w:type="table" w:customStyle="1" w:styleId="TableGridPHPDOCX">
     <w:name w:val="Table Grid PHPDOCX"/>
     <w:uiPriority w:val="59"/>
-    <w:rsid w:val="00493a0c"/>
+    <w:rsid w:val="00493A0C"/>
     <w:tblPr>
       <w:tblBorders>
-        <w:top w:val="single" w:color="auto" w:sz="4" w:space="0"/>
-        <w:left w:val="single" w:color="auto" w:sz="4" w:space="0"/>
-        <w:bottom w:val="single" w:color="auto" w:sz="4" w:space="0"/>
-        <w:right w:val="single" w:color="auto" w:sz="4" w:space="0"/>
-        <w:insideH w:val="single" w:color="auto" w:sz="4" w:space="0"/>
-        <w:insideV w:val="single" w:color="auto" w:sz="4" w:space="0"/>
+        <w:top w:val="single" w:sz="4" w:space="0" w:color="auto"/>
+        <w:left w:val="single" w:sz="4" w:space="0" w:color="auto"/>
+        <w:bottom w:val="single" w:sz="4" w:space="0" w:color="auto"/>
+        <w:right w:val="single" w:sz="4" w:space="0" w:color="auto"/>
+        <w:insideH w:val="single" w:sz="4" w:space="0" w:color="auto"/>
+        <w:insideV w:val="single" w:sz="4" w:space="0" w:color="auto"/>
       </w:tblBorders>
       <w:tblCellMar>
         <w:top w:w="0" w:type="dxa"/>
@@ -3080,11 +3355,45 @@
       </w:tblCellMar>
     </w:tblPr>
   </w:style>
+  <w:style w:type="paragraph" w:styleId="Endnotentext">
+    <w:name w:val="endnote text"/>
+    <w:basedOn w:val="Standard"/>
+    <w:link w:val="EndnotentextZchn"/>
+    <w:uiPriority w:val="99"/>
+    <w:semiHidden/>
+    <w:unhideWhenUsed/>
+    <w:rsid w:val="00A14D4A"/>
+    <w:rPr>
+      <w:sz w:val="20"/>
+    </w:rPr>
+  </w:style>
+  <w:style w:type="character" w:customStyle="1" w:styleId="EndnotentextZchn">
+    <w:name w:val="Endnotentext Zchn"/>
+    <w:basedOn w:val="Absatz-Standardschriftart"/>
+    <w:link w:val="Endnotentext"/>
+    <w:uiPriority w:val="99"/>
+    <w:semiHidden/>
+    <w:rsid w:val="00A14D4A"/>
+    <w:rPr>
+      <w:rFonts w:ascii="Arial" w:hAnsi="Arial"/>
+    </w:rPr>
+  </w:style>
+  <w:style w:type="character" w:styleId="Endnotenzeichen">
+    <w:name w:val="endnote reference"/>
+    <w:basedOn w:val="Absatz-Standardschriftart"/>
+    <w:uiPriority w:val="99"/>
+    <w:semiHidden/>
+    <w:unhideWhenUsed/>
+    <w:rsid w:val="00A14D4A"/>
+    <w:rPr>
+      <w:vertAlign w:val="superscript"/>
+    </w:rPr>
+  </w:style>
 </w:styles>
 </file>
 
 <file path=word/theme/theme1.xml><?xml version="1.0" encoding="utf-8"?>
-<a:theme xmlns:a="http://schemas.openxmlformats.org/drawingml/2006/main" xmlns:r="http://schemas.openxmlformats.org/officeDocument/2006/relationships" name="Office">
+<a:theme xmlns:a="http://schemas.openxmlformats.org/drawingml/2006/main" name="Office">
   <a:themeElements>
     <a:clrScheme name="Office">
       <a:dk1>
@@ -3126,12 +3435,12 @@
     </a:clrScheme>
     <a:fontScheme name="Office">
       <a:majorFont>
-        <a:latin typeface="Calibri Light" panose="020F0302020204030204" pitchFamily="0" charset="1"/>
+        <a:latin typeface="Calibri Light" panose="020F0302020204030204"/>
         <a:ea typeface=""/>
         <a:cs typeface=""/>
       </a:majorFont>
       <a:minorFont>
-        <a:latin typeface="Calibri" panose="020F0502020204030204" pitchFamily="0" charset="1"/>
+        <a:latin typeface="Calibri" panose="020F0502020204030204"/>
         <a:ea typeface=""/>
         <a:cs typeface=""/>
       </a:minorFont>
@@ -3163,7 +3472,7 @@
             </a:gs>
           </a:gsLst>
           <a:lin ang="5400000" scaled="0"/>
-          <a:tileRect l="0" t="0" r="0" b="0"/>
+          <a:tileRect/>
         </a:gradFill>
         <a:gradFill>
           <a:gsLst>
@@ -3187,7 +3496,7 @@
             </a:gs>
           </a:gsLst>
           <a:lin ang="5400000" scaled="0"/>
-          <a:tileRect l="0" t="0" r="0" b="0"/>
+          <a:tileRect/>
         </a:gradFill>
       </a:fillStyleLst>
       <a:lnStyleLst>
@@ -3247,11 +3556,13 @@
             </a:gs>
           </a:gsLst>
           <a:lin ang="5400000" scaled="0"/>
-          <a:tileRect l="0" t="0" r="0" b="0"/>
+          <a:tileRect/>
         </a:gradFill>
       </a:bgFillStyleLst>
     </a:fmtScheme>
   </a:themeElements>
+  <a:objectDefaults/>
+  <a:extraClrSchemeLst/>
 </a:theme>
 </file>
 

</xml_diff>